<commit_message>
Carry the local business on every page instead of site-wide
Drops the separate site-wide block. Each service page now emits one
self-contained graph: LocalBusiness, WebSite, WebPage, BreadcrumbList
and Service, so a page can be shipped on its own with nothing global to
install.

The business @id stays identical across all eleven pages, so the
repeated definitions resolve to a single business entity rather than
eleven competing ones. That property is what makes the repetition safe,
so it must not be varied per page.

Word files regenerated to match: the sitewide document is gone and each
page document now summarises the local business details it carries.

Co-Authored-By: Claude Opus 5 <noreply@anthropic.com>
Claude-Session: https://claude.ai/code/session_014SrWN23tgHuNWUJD2CEJfQ
</commit_message>
<xml_diff>
--- a/schema/buildinginspectionsnearme.com.au/output/docx/adjoining-works-protection.docx
+++ b/schema/buildinginspectionsnearme.com.au/output/docx/adjoining-works-protection.docx
@@ -142,7 +142,7 @@
                 <w:sz w:val="19"/>
                 <w:szCs w:val="19"/>
               </w:rPr>
-              <w:t xml:space="preserve">WebPage, BreadcrumbList, Service</w:t>
+              <w:t xml:space="preserve">LocalBusiness (HomeAndConstructionBusiness / ProfessionalService), WebSite, WebPage, BreadcrumbList, Service</w:t>
             </w:r>
           </w:p>
         </w:tc>
@@ -475,6 +475,2934 @@
           <w:sz w:val="14"/>
           <w:szCs w:val="14"/>
         </w:rPr>
+        <w:t xml:space="preserve">      "@type": [</w:t>
+      </w:r>
+    </w:p>
+    <w:p>
+      <w:pPr>
+        <w:shd w:fill="F4F6F8" w:color="auto" w:val="clear"/>
+        <w:spacing w:after="0" w:before="0" w:line="240"/>
+        <w:ind w:left="120" w:right="120"/>
+      </w:pPr>
+      <w:r>
+        <w:rPr>
+          <w:rFonts w:ascii="Consolas" w:cs="Consolas" w:eastAsia="Consolas" w:hAnsi="Consolas"/>
+          <w:color w:val="1B2733"/>
+          <w:sz w:val="14"/>
+          <w:szCs w:val="14"/>
+        </w:rPr>
+        <w:t xml:space="preserve">        "HomeAndConstructionBusiness",</w:t>
+      </w:r>
+    </w:p>
+    <w:p>
+      <w:pPr>
+        <w:shd w:fill="F4F6F8" w:color="auto" w:val="clear"/>
+        <w:spacing w:after="0" w:before="0" w:line="240"/>
+        <w:ind w:left="120" w:right="120"/>
+      </w:pPr>
+      <w:r>
+        <w:rPr>
+          <w:rFonts w:ascii="Consolas" w:cs="Consolas" w:eastAsia="Consolas" w:hAnsi="Consolas"/>
+          <w:color w:val="1B2733"/>
+          <w:sz w:val="14"/>
+          <w:szCs w:val="14"/>
+        </w:rPr>
+        <w:t xml:space="preserve">        "ProfessionalService"</w:t>
+      </w:r>
+    </w:p>
+    <w:p>
+      <w:pPr>
+        <w:shd w:fill="F4F6F8" w:color="auto" w:val="clear"/>
+        <w:spacing w:after="0" w:before="0" w:line="240"/>
+        <w:ind w:left="120" w:right="120"/>
+      </w:pPr>
+      <w:r>
+        <w:rPr>
+          <w:rFonts w:ascii="Consolas" w:cs="Consolas" w:eastAsia="Consolas" w:hAnsi="Consolas"/>
+          <w:color w:val="1B2733"/>
+          <w:sz w:val="14"/>
+          <w:szCs w:val="14"/>
+        </w:rPr>
+        <w:t xml:space="preserve">      ],</w:t>
+      </w:r>
+    </w:p>
+    <w:p>
+      <w:pPr>
+        <w:shd w:fill="F4F6F8" w:color="auto" w:val="clear"/>
+        <w:spacing w:after="0" w:before="0" w:line="240"/>
+        <w:ind w:left="120" w:right="120"/>
+      </w:pPr>
+      <w:r>
+        <w:rPr>
+          <w:rFonts w:ascii="Consolas" w:cs="Consolas" w:eastAsia="Consolas" w:hAnsi="Consolas"/>
+          <w:color w:val="1B2733"/>
+          <w:sz w:val="14"/>
+          <w:szCs w:val="14"/>
+        </w:rPr>
+        <w:t xml:space="preserve">      "@id": "https://buildinginspectionsnearme.com.au/#organization",</w:t>
+      </w:r>
+    </w:p>
+    <w:p>
+      <w:pPr>
+        <w:shd w:fill="F4F6F8" w:color="auto" w:val="clear"/>
+        <w:spacing w:after="0" w:before="0" w:line="240"/>
+        <w:ind w:left="120" w:right="120"/>
+      </w:pPr>
+      <w:r>
+        <w:rPr>
+          <w:rFonts w:ascii="Consolas" w:cs="Consolas" w:eastAsia="Consolas" w:hAnsi="Consolas"/>
+          <w:color w:val="1B2733"/>
+          <w:sz w:val="14"/>
+          <w:szCs w:val="14"/>
+        </w:rPr>
+        <w:t xml:space="preserve">      "name": "Building Inspections Near Me",</w:t>
+      </w:r>
+    </w:p>
+    <w:p>
+      <w:pPr>
+        <w:shd w:fill="F4F6F8" w:color="auto" w:val="clear"/>
+        <w:spacing w:after="0" w:before="0" w:line="240"/>
+        <w:ind w:left="120" w:right="120"/>
+      </w:pPr>
+      <w:r>
+        <w:rPr>
+          <w:rFonts w:ascii="Consolas" w:cs="Consolas" w:eastAsia="Consolas" w:hAnsi="Consolas"/>
+          <w:color w:val="1B2733"/>
+          <w:sz w:val="14"/>
+          <w:szCs w:val="14"/>
+        </w:rPr>
+        <w:t xml:space="preserve">      "alternateName": "BINM",</w:t>
+      </w:r>
+    </w:p>
+    <w:p>
+      <w:pPr>
+        <w:shd w:fill="F4F6F8" w:color="auto" w:val="clear"/>
+        <w:spacing w:after="0" w:before="0" w:line="240"/>
+        <w:ind w:left="120" w:right="120"/>
+      </w:pPr>
+      <w:r>
+        <w:rPr>
+          <w:rFonts w:ascii="Consolas" w:cs="Consolas" w:eastAsia="Consolas" w:hAnsi="Consolas"/>
+          <w:color w:val="1B2733"/>
+          <w:sz w:val="14"/>
+          <w:szCs w:val="14"/>
+        </w:rPr>
+        <w:t xml:space="preserve">      "slogan": "Inspect Once. Upgrade Report Anytime.",</w:t>
+      </w:r>
+    </w:p>
+    <w:p>
+      <w:pPr>
+        <w:shd w:fill="F4F6F8" w:color="auto" w:val="clear"/>
+        <w:spacing w:after="0" w:before="0" w:line="240"/>
+        <w:ind w:left="120" w:right="120"/>
+      </w:pPr>
+      <w:r>
+        <w:rPr>
+          <w:rFonts w:ascii="Consolas" w:cs="Consolas" w:eastAsia="Consolas" w:hAnsi="Consolas"/>
+          <w:color w:val="1B2733"/>
+          <w:sz w:val="14"/>
+          <w:szCs w:val="14"/>
+        </w:rPr>
+        <w:t xml:space="preserve">      "description": "Building Inspections Near Me (BINM) is an engineer-led building inspection service operating across Australia. Every inspection is conducted by a Chartered Engineer or Licensed Builder at standard inspection rates, so the same site data can be escalated to a formal engineering report or a tribunal-ready expert report without a second inspection.",</w:t>
+      </w:r>
+    </w:p>
+    <w:p>
+      <w:pPr>
+        <w:shd w:fill="F4F6F8" w:color="auto" w:val="clear"/>
+        <w:spacing w:after="0" w:before="0" w:line="240"/>
+        <w:ind w:left="120" w:right="120"/>
+      </w:pPr>
+      <w:r>
+        <w:rPr>
+          <w:rFonts w:ascii="Consolas" w:cs="Consolas" w:eastAsia="Consolas" w:hAnsi="Consolas"/>
+          <w:color w:val="1B2733"/>
+          <w:sz w:val="14"/>
+          <w:szCs w:val="14"/>
+        </w:rPr>
+        <w:t xml:space="preserve">      "url": "https://buildinginspectionsnearme.com.au/",</w:t>
+      </w:r>
+    </w:p>
+    <w:p>
+      <w:pPr>
+        <w:shd w:fill="F4F6F8" w:color="auto" w:val="clear"/>
+        <w:spacing w:after="0" w:before="0" w:line="240"/>
+        <w:ind w:left="120" w:right="120"/>
+      </w:pPr>
+      <w:r>
+        <w:rPr>
+          <w:rFonts w:ascii="Consolas" w:cs="Consolas" w:eastAsia="Consolas" w:hAnsi="Consolas"/>
+          <w:color w:val="1B2733"/>
+          <w:sz w:val="14"/>
+          <w:szCs w:val="14"/>
+        </w:rPr>
+        <w:t xml:space="preserve">      "telephone": "+61-1800-796-776",</w:t>
+      </w:r>
+    </w:p>
+    <w:p>
+      <w:pPr>
+        <w:shd w:fill="F4F6F8" w:color="auto" w:val="clear"/>
+        <w:spacing w:after="0" w:before="0" w:line="240"/>
+        <w:ind w:left="120" w:right="120"/>
+      </w:pPr>
+      <w:r>
+        <w:rPr>
+          <w:rFonts w:ascii="Consolas" w:cs="Consolas" w:eastAsia="Consolas" w:hAnsi="Consolas"/>
+          <w:color w:val="1B2733"/>
+          <w:sz w:val="14"/>
+          <w:szCs w:val="14"/>
+        </w:rPr>
+        <w:t xml:space="preserve">      "priceRange": "From $495 inc. GST",</w:t>
+      </w:r>
+    </w:p>
+    <w:p>
+      <w:pPr>
+        <w:shd w:fill="F4F6F8" w:color="auto" w:val="clear"/>
+        <w:spacing w:after="0" w:before="0" w:line="240"/>
+        <w:ind w:left="120" w:right="120"/>
+      </w:pPr>
+      <w:r>
+        <w:rPr>
+          <w:rFonts w:ascii="Consolas" w:cs="Consolas" w:eastAsia="Consolas" w:hAnsi="Consolas"/>
+          <w:color w:val="1B2733"/>
+          <w:sz w:val="14"/>
+          <w:szCs w:val="14"/>
+        </w:rPr>
+        <w:t xml:space="preserve">      "currenciesAccepted": "AUD",</w:t>
+      </w:r>
+    </w:p>
+    <w:p>
+      <w:pPr>
+        <w:shd w:fill="F4F6F8" w:color="auto" w:val="clear"/>
+        <w:spacing w:after="0" w:before="0" w:line="240"/>
+        <w:ind w:left="120" w:right="120"/>
+      </w:pPr>
+      <w:r>
+        <w:rPr>
+          <w:rFonts w:ascii="Consolas" w:cs="Consolas" w:eastAsia="Consolas" w:hAnsi="Consolas"/>
+          <w:color w:val="1B2733"/>
+          <w:sz w:val="14"/>
+          <w:szCs w:val="14"/>
+        </w:rPr>
+        <w:t xml:space="preserve">      "areaServed": [</w:t>
+      </w:r>
+    </w:p>
+    <w:p>
+      <w:pPr>
+        <w:shd w:fill="F4F6F8" w:color="auto" w:val="clear"/>
+        <w:spacing w:after="0" w:before="0" w:line="240"/>
+        <w:ind w:left="120" w:right="120"/>
+      </w:pPr>
+      <w:r>
+        <w:rPr>
+          <w:rFonts w:ascii="Consolas" w:cs="Consolas" w:eastAsia="Consolas" w:hAnsi="Consolas"/>
+          <w:color w:val="1B2733"/>
+          <w:sz w:val="14"/>
+          <w:szCs w:val="14"/>
+        </w:rPr>
+        <w:t xml:space="preserve">        {</w:t>
+      </w:r>
+    </w:p>
+    <w:p>
+      <w:pPr>
+        <w:shd w:fill="F4F6F8" w:color="auto" w:val="clear"/>
+        <w:spacing w:after="0" w:before="0" w:line="240"/>
+        <w:ind w:left="120" w:right="120"/>
+      </w:pPr>
+      <w:r>
+        <w:rPr>
+          <w:rFonts w:ascii="Consolas" w:cs="Consolas" w:eastAsia="Consolas" w:hAnsi="Consolas"/>
+          <w:color w:val="1B2733"/>
+          <w:sz w:val="14"/>
+          <w:szCs w:val="14"/>
+        </w:rPr>
+        <w:t xml:space="preserve">          "@type": "Country",</w:t>
+      </w:r>
+    </w:p>
+    <w:p>
+      <w:pPr>
+        <w:shd w:fill="F4F6F8" w:color="auto" w:val="clear"/>
+        <w:spacing w:after="0" w:before="0" w:line="240"/>
+        <w:ind w:left="120" w:right="120"/>
+      </w:pPr>
+      <w:r>
+        <w:rPr>
+          <w:rFonts w:ascii="Consolas" w:cs="Consolas" w:eastAsia="Consolas" w:hAnsi="Consolas"/>
+          <w:color w:val="1B2733"/>
+          <w:sz w:val="14"/>
+          <w:szCs w:val="14"/>
+        </w:rPr>
+        <w:t xml:space="preserve">          "name": "Australia",</w:t>
+      </w:r>
+    </w:p>
+    <w:p>
+      <w:pPr>
+        <w:shd w:fill="F4F6F8" w:color="auto" w:val="clear"/>
+        <w:spacing w:after="0" w:before="0" w:line="240"/>
+        <w:ind w:left="120" w:right="120"/>
+      </w:pPr>
+      <w:r>
+        <w:rPr>
+          <w:rFonts w:ascii="Consolas" w:cs="Consolas" w:eastAsia="Consolas" w:hAnsi="Consolas"/>
+          <w:color w:val="1B2733"/>
+          <w:sz w:val="14"/>
+          <w:szCs w:val="14"/>
+        </w:rPr>
+        <w:t xml:space="preserve">          "sameAs": "https://www.wikidata.org/wiki/Q408"</w:t>
+      </w:r>
+    </w:p>
+    <w:p>
+      <w:pPr>
+        <w:shd w:fill="F4F6F8" w:color="auto" w:val="clear"/>
+        <w:spacing w:after="0" w:before="0" w:line="240"/>
+        <w:ind w:left="120" w:right="120"/>
+      </w:pPr>
+      <w:r>
+        <w:rPr>
+          <w:rFonts w:ascii="Consolas" w:cs="Consolas" w:eastAsia="Consolas" w:hAnsi="Consolas"/>
+          <w:color w:val="1B2733"/>
+          <w:sz w:val="14"/>
+          <w:szCs w:val="14"/>
+        </w:rPr>
+        <w:t xml:space="preserve">        },</w:t>
+      </w:r>
+    </w:p>
+    <w:p>
+      <w:pPr>
+        <w:shd w:fill="F4F6F8" w:color="auto" w:val="clear"/>
+        <w:spacing w:after="0" w:before="0" w:line="240"/>
+        <w:ind w:left="120" w:right="120"/>
+      </w:pPr>
+      <w:r>
+        <w:rPr>
+          <w:rFonts w:ascii="Consolas" w:cs="Consolas" w:eastAsia="Consolas" w:hAnsi="Consolas"/>
+          <w:color w:val="1B2733"/>
+          <w:sz w:val="14"/>
+          <w:szCs w:val="14"/>
+        </w:rPr>
+        <w:t xml:space="preserve">        {</w:t>
+      </w:r>
+    </w:p>
+    <w:p>
+      <w:pPr>
+        <w:shd w:fill="F4F6F8" w:color="auto" w:val="clear"/>
+        <w:spacing w:after="0" w:before="0" w:line="240"/>
+        <w:ind w:left="120" w:right="120"/>
+      </w:pPr>
+      <w:r>
+        <w:rPr>
+          <w:rFonts w:ascii="Consolas" w:cs="Consolas" w:eastAsia="Consolas" w:hAnsi="Consolas"/>
+          <w:color w:val="1B2733"/>
+          <w:sz w:val="14"/>
+          <w:szCs w:val="14"/>
+        </w:rPr>
+        <w:t xml:space="preserve">          "@type": "City",</w:t>
+      </w:r>
+    </w:p>
+    <w:p>
+      <w:pPr>
+        <w:shd w:fill="F4F6F8" w:color="auto" w:val="clear"/>
+        <w:spacing w:after="0" w:before="0" w:line="240"/>
+        <w:ind w:left="120" w:right="120"/>
+      </w:pPr>
+      <w:r>
+        <w:rPr>
+          <w:rFonts w:ascii="Consolas" w:cs="Consolas" w:eastAsia="Consolas" w:hAnsi="Consolas"/>
+          <w:color w:val="1B2733"/>
+          <w:sz w:val="14"/>
+          <w:szCs w:val="14"/>
+        </w:rPr>
+        <w:t xml:space="preserve">          "name": "Melbourne",</w:t>
+      </w:r>
+    </w:p>
+    <w:p>
+      <w:pPr>
+        <w:shd w:fill="F4F6F8" w:color="auto" w:val="clear"/>
+        <w:spacing w:after="0" w:before="0" w:line="240"/>
+        <w:ind w:left="120" w:right="120"/>
+      </w:pPr>
+      <w:r>
+        <w:rPr>
+          <w:rFonts w:ascii="Consolas" w:cs="Consolas" w:eastAsia="Consolas" w:hAnsi="Consolas"/>
+          <w:color w:val="1B2733"/>
+          <w:sz w:val="14"/>
+          <w:szCs w:val="14"/>
+        </w:rPr>
+        <w:t xml:space="preserve">          "sameAs": "https://www.wikidata.org/wiki/Q3141"</w:t>
+      </w:r>
+    </w:p>
+    <w:p>
+      <w:pPr>
+        <w:shd w:fill="F4F6F8" w:color="auto" w:val="clear"/>
+        <w:spacing w:after="0" w:before="0" w:line="240"/>
+        <w:ind w:left="120" w:right="120"/>
+      </w:pPr>
+      <w:r>
+        <w:rPr>
+          <w:rFonts w:ascii="Consolas" w:cs="Consolas" w:eastAsia="Consolas" w:hAnsi="Consolas"/>
+          <w:color w:val="1B2733"/>
+          <w:sz w:val="14"/>
+          <w:szCs w:val="14"/>
+        </w:rPr>
+        <w:t xml:space="preserve">        },</w:t>
+      </w:r>
+    </w:p>
+    <w:p>
+      <w:pPr>
+        <w:shd w:fill="F4F6F8" w:color="auto" w:val="clear"/>
+        <w:spacing w:after="0" w:before="0" w:line="240"/>
+        <w:ind w:left="120" w:right="120"/>
+      </w:pPr>
+      <w:r>
+        <w:rPr>
+          <w:rFonts w:ascii="Consolas" w:cs="Consolas" w:eastAsia="Consolas" w:hAnsi="Consolas"/>
+          <w:color w:val="1B2733"/>
+          <w:sz w:val="14"/>
+          <w:szCs w:val="14"/>
+        </w:rPr>
+        <w:t xml:space="preserve">        {</w:t>
+      </w:r>
+    </w:p>
+    <w:p>
+      <w:pPr>
+        <w:shd w:fill="F4F6F8" w:color="auto" w:val="clear"/>
+        <w:spacing w:after="0" w:before="0" w:line="240"/>
+        <w:ind w:left="120" w:right="120"/>
+      </w:pPr>
+      <w:r>
+        <w:rPr>
+          <w:rFonts w:ascii="Consolas" w:cs="Consolas" w:eastAsia="Consolas" w:hAnsi="Consolas"/>
+          <w:color w:val="1B2733"/>
+          <w:sz w:val="14"/>
+          <w:szCs w:val="14"/>
+        </w:rPr>
+        <w:t xml:space="preserve">          "@type": "City",</w:t>
+      </w:r>
+    </w:p>
+    <w:p>
+      <w:pPr>
+        <w:shd w:fill="F4F6F8" w:color="auto" w:val="clear"/>
+        <w:spacing w:after="0" w:before="0" w:line="240"/>
+        <w:ind w:left="120" w:right="120"/>
+      </w:pPr>
+      <w:r>
+        <w:rPr>
+          <w:rFonts w:ascii="Consolas" w:cs="Consolas" w:eastAsia="Consolas" w:hAnsi="Consolas"/>
+          <w:color w:val="1B2733"/>
+          <w:sz w:val="14"/>
+          <w:szCs w:val="14"/>
+        </w:rPr>
+        <w:t xml:space="preserve">          "name": "Sydney",</w:t>
+      </w:r>
+    </w:p>
+    <w:p>
+      <w:pPr>
+        <w:shd w:fill="F4F6F8" w:color="auto" w:val="clear"/>
+        <w:spacing w:after="0" w:before="0" w:line="240"/>
+        <w:ind w:left="120" w:right="120"/>
+      </w:pPr>
+      <w:r>
+        <w:rPr>
+          <w:rFonts w:ascii="Consolas" w:cs="Consolas" w:eastAsia="Consolas" w:hAnsi="Consolas"/>
+          <w:color w:val="1B2733"/>
+          <w:sz w:val="14"/>
+          <w:szCs w:val="14"/>
+        </w:rPr>
+        <w:t xml:space="preserve">          "sameAs": "https://www.wikidata.org/wiki/Q3130"</w:t>
+      </w:r>
+    </w:p>
+    <w:p>
+      <w:pPr>
+        <w:shd w:fill="F4F6F8" w:color="auto" w:val="clear"/>
+        <w:spacing w:after="0" w:before="0" w:line="240"/>
+        <w:ind w:left="120" w:right="120"/>
+      </w:pPr>
+      <w:r>
+        <w:rPr>
+          <w:rFonts w:ascii="Consolas" w:cs="Consolas" w:eastAsia="Consolas" w:hAnsi="Consolas"/>
+          <w:color w:val="1B2733"/>
+          <w:sz w:val="14"/>
+          <w:szCs w:val="14"/>
+        </w:rPr>
+        <w:t xml:space="preserve">        },</w:t>
+      </w:r>
+    </w:p>
+    <w:p>
+      <w:pPr>
+        <w:shd w:fill="F4F6F8" w:color="auto" w:val="clear"/>
+        <w:spacing w:after="0" w:before="0" w:line="240"/>
+        <w:ind w:left="120" w:right="120"/>
+      </w:pPr>
+      <w:r>
+        <w:rPr>
+          <w:rFonts w:ascii="Consolas" w:cs="Consolas" w:eastAsia="Consolas" w:hAnsi="Consolas"/>
+          <w:color w:val="1B2733"/>
+          <w:sz w:val="14"/>
+          <w:szCs w:val="14"/>
+        </w:rPr>
+        <w:t xml:space="preserve">        {</w:t>
+      </w:r>
+    </w:p>
+    <w:p>
+      <w:pPr>
+        <w:shd w:fill="F4F6F8" w:color="auto" w:val="clear"/>
+        <w:spacing w:after="0" w:before="0" w:line="240"/>
+        <w:ind w:left="120" w:right="120"/>
+      </w:pPr>
+      <w:r>
+        <w:rPr>
+          <w:rFonts w:ascii="Consolas" w:cs="Consolas" w:eastAsia="Consolas" w:hAnsi="Consolas"/>
+          <w:color w:val="1B2733"/>
+          <w:sz w:val="14"/>
+          <w:szCs w:val="14"/>
+        </w:rPr>
+        <w:t xml:space="preserve">          "@type": "City",</w:t>
+      </w:r>
+    </w:p>
+    <w:p>
+      <w:pPr>
+        <w:shd w:fill="F4F6F8" w:color="auto" w:val="clear"/>
+        <w:spacing w:after="0" w:before="0" w:line="240"/>
+        <w:ind w:left="120" w:right="120"/>
+      </w:pPr>
+      <w:r>
+        <w:rPr>
+          <w:rFonts w:ascii="Consolas" w:cs="Consolas" w:eastAsia="Consolas" w:hAnsi="Consolas"/>
+          <w:color w:val="1B2733"/>
+          <w:sz w:val="14"/>
+          <w:szCs w:val="14"/>
+        </w:rPr>
+        <w:t xml:space="preserve">          "name": "Brisbane",</w:t>
+      </w:r>
+    </w:p>
+    <w:p>
+      <w:pPr>
+        <w:shd w:fill="F4F6F8" w:color="auto" w:val="clear"/>
+        <w:spacing w:after="0" w:before="0" w:line="240"/>
+        <w:ind w:left="120" w:right="120"/>
+      </w:pPr>
+      <w:r>
+        <w:rPr>
+          <w:rFonts w:ascii="Consolas" w:cs="Consolas" w:eastAsia="Consolas" w:hAnsi="Consolas"/>
+          <w:color w:val="1B2733"/>
+          <w:sz w:val="14"/>
+          <w:szCs w:val="14"/>
+        </w:rPr>
+        <w:t xml:space="preserve">          "sameAs": "https://www.wikidata.org/wiki/Q34932"</w:t>
+      </w:r>
+    </w:p>
+    <w:p>
+      <w:pPr>
+        <w:shd w:fill="F4F6F8" w:color="auto" w:val="clear"/>
+        <w:spacing w:after="0" w:before="0" w:line="240"/>
+        <w:ind w:left="120" w:right="120"/>
+      </w:pPr>
+      <w:r>
+        <w:rPr>
+          <w:rFonts w:ascii="Consolas" w:cs="Consolas" w:eastAsia="Consolas" w:hAnsi="Consolas"/>
+          <w:color w:val="1B2733"/>
+          <w:sz w:val="14"/>
+          <w:szCs w:val="14"/>
+        </w:rPr>
+        <w:t xml:space="preserve">        },</w:t>
+      </w:r>
+    </w:p>
+    <w:p>
+      <w:pPr>
+        <w:shd w:fill="F4F6F8" w:color="auto" w:val="clear"/>
+        <w:spacing w:after="0" w:before="0" w:line="240"/>
+        <w:ind w:left="120" w:right="120"/>
+      </w:pPr>
+      <w:r>
+        <w:rPr>
+          <w:rFonts w:ascii="Consolas" w:cs="Consolas" w:eastAsia="Consolas" w:hAnsi="Consolas"/>
+          <w:color w:val="1B2733"/>
+          <w:sz w:val="14"/>
+          <w:szCs w:val="14"/>
+        </w:rPr>
+        <w:t xml:space="preserve">        {</w:t>
+      </w:r>
+    </w:p>
+    <w:p>
+      <w:pPr>
+        <w:shd w:fill="F4F6F8" w:color="auto" w:val="clear"/>
+        <w:spacing w:after="0" w:before="0" w:line="240"/>
+        <w:ind w:left="120" w:right="120"/>
+      </w:pPr>
+      <w:r>
+        <w:rPr>
+          <w:rFonts w:ascii="Consolas" w:cs="Consolas" w:eastAsia="Consolas" w:hAnsi="Consolas"/>
+          <w:color w:val="1B2733"/>
+          <w:sz w:val="14"/>
+          <w:szCs w:val="14"/>
+        </w:rPr>
+        <w:t xml:space="preserve">          "@type": "City",</w:t>
+      </w:r>
+    </w:p>
+    <w:p>
+      <w:pPr>
+        <w:shd w:fill="F4F6F8" w:color="auto" w:val="clear"/>
+        <w:spacing w:after="0" w:before="0" w:line="240"/>
+        <w:ind w:left="120" w:right="120"/>
+      </w:pPr>
+      <w:r>
+        <w:rPr>
+          <w:rFonts w:ascii="Consolas" w:cs="Consolas" w:eastAsia="Consolas" w:hAnsi="Consolas"/>
+          <w:color w:val="1B2733"/>
+          <w:sz w:val="14"/>
+          <w:szCs w:val="14"/>
+        </w:rPr>
+        <w:t xml:space="preserve">          "name": "Adelaide",</w:t>
+      </w:r>
+    </w:p>
+    <w:p>
+      <w:pPr>
+        <w:shd w:fill="F4F6F8" w:color="auto" w:val="clear"/>
+        <w:spacing w:after="0" w:before="0" w:line="240"/>
+        <w:ind w:left="120" w:right="120"/>
+      </w:pPr>
+      <w:r>
+        <w:rPr>
+          <w:rFonts w:ascii="Consolas" w:cs="Consolas" w:eastAsia="Consolas" w:hAnsi="Consolas"/>
+          <w:color w:val="1B2733"/>
+          <w:sz w:val="14"/>
+          <w:szCs w:val="14"/>
+        </w:rPr>
+        <w:t xml:space="preserve">          "sameAs": "https://www.wikidata.org/wiki/Q5112"</w:t>
+      </w:r>
+    </w:p>
+    <w:p>
+      <w:pPr>
+        <w:shd w:fill="F4F6F8" w:color="auto" w:val="clear"/>
+        <w:spacing w:after="0" w:before="0" w:line="240"/>
+        <w:ind w:left="120" w:right="120"/>
+      </w:pPr>
+      <w:r>
+        <w:rPr>
+          <w:rFonts w:ascii="Consolas" w:cs="Consolas" w:eastAsia="Consolas" w:hAnsi="Consolas"/>
+          <w:color w:val="1B2733"/>
+          <w:sz w:val="14"/>
+          <w:szCs w:val="14"/>
+        </w:rPr>
+        <w:t xml:space="preserve">        }</w:t>
+      </w:r>
+    </w:p>
+    <w:p>
+      <w:pPr>
+        <w:shd w:fill="F4F6F8" w:color="auto" w:val="clear"/>
+        <w:spacing w:after="0" w:before="0" w:line="240"/>
+        <w:ind w:left="120" w:right="120"/>
+      </w:pPr>
+      <w:r>
+        <w:rPr>
+          <w:rFonts w:ascii="Consolas" w:cs="Consolas" w:eastAsia="Consolas" w:hAnsi="Consolas"/>
+          <w:color w:val="1B2733"/>
+          <w:sz w:val="14"/>
+          <w:szCs w:val="14"/>
+        </w:rPr>
+        <w:t xml:space="preserve">      ],</w:t>
+      </w:r>
+    </w:p>
+    <w:p>
+      <w:pPr>
+        <w:shd w:fill="F4F6F8" w:color="auto" w:val="clear"/>
+        <w:spacing w:after="0" w:before="0" w:line="240"/>
+        <w:ind w:left="120" w:right="120"/>
+      </w:pPr>
+      <w:r>
+        <w:rPr>
+          <w:rFonts w:ascii="Consolas" w:cs="Consolas" w:eastAsia="Consolas" w:hAnsi="Consolas"/>
+          <w:color w:val="1B2733"/>
+          <w:sz w:val="14"/>
+          <w:szCs w:val="14"/>
+        </w:rPr>
+        <w:t xml:space="preserve">      "knowsAbout": [</w:t>
+      </w:r>
+    </w:p>
+    <w:p>
+      <w:pPr>
+        <w:shd w:fill="F4F6F8" w:color="auto" w:val="clear"/>
+        <w:spacing w:after="0" w:before="0" w:line="240"/>
+        <w:ind w:left="120" w:right="120"/>
+      </w:pPr>
+      <w:r>
+        <w:rPr>
+          <w:rFonts w:ascii="Consolas" w:cs="Consolas" w:eastAsia="Consolas" w:hAnsi="Consolas"/>
+          <w:color w:val="1B2733"/>
+          <w:sz w:val="14"/>
+          <w:szCs w:val="14"/>
+        </w:rPr>
+        <w:t xml:space="preserve">        "Engineer-led building inspections",</w:t>
+      </w:r>
+    </w:p>
+    <w:p>
+      <w:pPr>
+        <w:shd w:fill="F4F6F8" w:color="auto" w:val="clear"/>
+        <w:spacing w:after="0" w:before="0" w:line="240"/>
+        <w:ind w:left="120" w:right="120"/>
+      </w:pPr>
+      <w:r>
+        <w:rPr>
+          <w:rFonts w:ascii="Consolas" w:cs="Consolas" w:eastAsia="Consolas" w:hAnsi="Consolas"/>
+          <w:color w:val="1B2733"/>
+          <w:sz w:val="14"/>
+          <w:szCs w:val="14"/>
+        </w:rPr>
+        <w:t xml:space="preserve">        "Pre-purchase building inspections",</w:t>
+      </w:r>
+    </w:p>
+    <w:p>
+      <w:pPr>
+        <w:shd w:fill="F4F6F8" w:color="auto" w:val="clear"/>
+        <w:spacing w:after="0" w:before="0" w:line="240"/>
+        <w:ind w:left="120" w:right="120"/>
+      </w:pPr>
+      <w:r>
+        <w:rPr>
+          <w:rFonts w:ascii="Consolas" w:cs="Consolas" w:eastAsia="Consolas" w:hAnsi="Consolas"/>
+          <w:color w:val="1B2733"/>
+          <w:sz w:val="14"/>
+          <w:szCs w:val="14"/>
+        </w:rPr>
+        <w:t xml:space="preserve">        "AS 4349.1 standard property inspections",</w:t>
+      </w:r>
+    </w:p>
+    <w:p>
+      <w:pPr>
+        <w:shd w:fill="F4F6F8" w:color="auto" w:val="clear"/>
+        <w:spacing w:after="0" w:before="0" w:line="240"/>
+        <w:ind w:left="120" w:right="120"/>
+      </w:pPr>
+      <w:r>
+        <w:rPr>
+          <w:rFonts w:ascii="Consolas" w:cs="Consolas" w:eastAsia="Consolas" w:hAnsi="Consolas"/>
+          <w:color w:val="1B2733"/>
+          <w:sz w:val="14"/>
+          <w:szCs w:val="14"/>
+        </w:rPr>
+        <w:t xml:space="preserve">        "AS 4349.3 timber pest inspections",</w:t>
+      </w:r>
+    </w:p>
+    <w:p>
+      <w:pPr>
+        <w:shd w:fill="F4F6F8" w:color="auto" w:val="clear"/>
+        <w:spacing w:after="0" w:before="0" w:line="240"/>
+        <w:ind w:left="120" w:right="120"/>
+      </w:pPr>
+      <w:r>
+        <w:rPr>
+          <w:rFonts w:ascii="Consolas" w:cs="Consolas" w:eastAsia="Consolas" w:hAnsi="Consolas"/>
+          <w:color w:val="1B2733"/>
+          <w:sz w:val="14"/>
+          <w:szCs w:val="14"/>
+        </w:rPr>
+        <w:t xml:space="preserve">        "AS 2870 residential slabs and footings",</w:t>
+      </w:r>
+    </w:p>
+    <w:p>
+      <w:pPr>
+        <w:shd w:fill="F4F6F8" w:color="auto" w:val="clear"/>
+        <w:spacing w:after="0" w:before="0" w:line="240"/>
+        <w:ind w:left="120" w:right="120"/>
+      </w:pPr>
+      <w:r>
+        <w:rPr>
+          <w:rFonts w:ascii="Consolas" w:cs="Consolas" w:eastAsia="Consolas" w:hAnsi="Consolas"/>
+          <w:color w:val="1B2733"/>
+          <w:sz w:val="14"/>
+          <w:szCs w:val="14"/>
+        </w:rPr>
+        <w:t xml:space="preserve">        "National Construction Code compliance",</w:t>
+      </w:r>
+    </w:p>
+    <w:p>
+      <w:pPr>
+        <w:shd w:fill="F4F6F8" w:color="auto" w:val="clear"/>
+        <w:spacing w:after="0" w:before="0" w:line="240"/>
+        <w:ind w:left="120" w:right="120"/>
+      </w:pPr>
+      <w:r>
+        <w:rPr>
+          <w:rFonts w:ascii="Consolas" w:cs="Consolas" w:eastAsia="Consolas" w:hAnsi="Consolas"/>
+          <w:color w:val="1B2733"/>
+          <w:sz w:val="14"/>
+          <w:szCs w:val="14"/>
+        </w:rPr>
+        <w:t xml:space="preserve">        "Construction stage inspections",</w:t>
+      </w:r>
+    </w:p>
+    <w:p>
+      <w:pPr>
+        <w:shd w:fill="F4F6F8" w:color="auto" w:val="clear"/>
+        <w:spacing w:after="0" w:before="0" w:line="240"/>
+        <w:ind w:left="120" w:right="120"/>
+      </w:pPr>
+      <w:r>
+        <w:rPr>
+          <w:rFonts w:ascii="Consolas" w:cs="Consolas" w:eastAsia="Consolas" w:hAnsi="Consolas"/>
+          <w:color w:val="1B2733"/>
+          <w:sz w:val="14"/>
+          <w:szCs w:val="14"/>
+        </w:rPr>
+        <w:t xml:space="preserve">        "Dilapidation surveys and adjoining property protection",</w:t>
+      </w:r>
+    </w:p>
+    <w:p>
+      <w:pPr>
+        <w:shd w:fill="F4F6F8" w:color="auto" w:val="clear"/>
+        <w:spacing w:after="0" w:before="0" w:line="240"/>
+        <w:ind w:left="120" w:right="120"/>
+      </w:pPr>
+      <w:r>
+        <w:rPr>
+          <w:rFonts w:ascii="Consolas" w:cs="Consolas" w:eastAsia="Consolas" w:hAnsi="Consolas"/>
+          <w:color w:val="1B2733"/>
+          <w:sz w:val="14"/>
+          <w:szCs w:val="14"/>
+        </w:rPr>
+        <w:t xml:space="preserve">        "Strata and common property inspections",</w:t>
+      </w:r>
+    </w:p>
+    <w:p>
+      <w:pPr>
+        <w:shd w:fill="F4F6F8" w:color="auto" w:val="clear"/>
+        <w:spacing w:after="0" w:before="0" w:line="240"/>
+        <w:ind w:left="120" w:right="120"/>
+      </w:pPr>
+      <w:r>
+        <w:rPr>
+          <w:rFonts w:ascii="Consolas" w:cs="Consolas" w:eastAsia="Consolas" w:hAnsi="Consolas"/>
+          <w:color w:val="1B2733"/>
+          <w:sz w:val="14"/>
+          <w:szCs w:val="14"/>
+        </w:rPr>
+        <w:t xml:space="preserve">        "Building defect and causation investigation",</w:t>
+      </w:r>
+    </w:p>
+    <w:p>
+      <w:pPr>
+        <w:shd w:fill="F4F6F8" w:color="auto" w:val="clear"/>
+        <w:spacing w:after="0" w:before="0" w:line="240"/>
+        <w:ind w:left="120" w:right="120"/>
+      </w:pPr>
+      <w:r>
+        <w:rPr>
+          <w:rFonts w:ascii="Consolas" w:cs="Consolas" w:eastAsia="Consolas" w:hAnsi="Consolas"/>
+          <w:color w:val="1B2733"/>
+          <w:sz w:val="14"/>
+          <w:szCs w:val="14"/>
+        </w:rPr>
+        <w:t xml:space="preserve">        "Floor level surveys and movement monitoring",</w:t>
+      </w:r>
+    </w:p>
+    <w:p>
+      <w:pPr>
+        <w:shd w:fill="F4F6F8" w:color="auto" w:val="clear"/>
+        <w:spacing w:after="0" w:before="0" w:line="240"/>
+        <w:ind w:left="120" w:right="120"/>
+      </w:pPr>
+      <w:r>
+        <w:rPr>
+          <w:rFonts w:ascii="Consolas" w:cs="Consolas" w:eastAsia="Consolas" w:hAnsi="Consolas"/>
+          <w:color w:val="1B2733"/>
+          <w:sz w:val="14"/>
+          <w:szCs w:val="14"/>
+        </w:rPr>
+        <w:t xml:space="preserve">        "VCAT and DBDRV expert reports"</w:t>
+      </w:r>
+    </w:p>
+    <w:p>
+      <w:pPr>
+        <w:shd w:fill="F4F6F8" w:color="auto" w:val="clear"/>
+        <w:spacing w:after="0" w:before="0" w:line="240"/>
+        <w:ind w:left="120" w:right="120"/>
+      </w:pPr>
+      <w:r>
+        <w:rPr>
+          <w:rFonts w:ascii="Consolas" w:cs="Consolas" w:eastAsia="Consolas" w:hAnsi="Consolas"/>
+          <w:color w:val="1B2733"/>
+          <w:sz w:val="14"/>
+          <w:szCs w:val="14"/>
+        </w:rPr>
+        <w:t xml:space="preserve">      ],</w:t>
+      </w:r>
+    </w:p>
+    <w:p>
+      <w:pPr>
+        <w:shd w:fill="F4F6F8" w:color="auto" w:val="clear"/>
+        <w:spacing w:after="0" w:before="0" w:line="240"/>
+        <w:ind w:left="120" w:right="120"/>
+      </w:pPr>
+      <w:r>
+        <w:rPr>
+          <w:rFonts w:ascii="Consolas" w:cs="Consolas" w:eastAsia="Consolas" w:hAnsi="Consolas"/>
+          <w:color w:val="1B2733"/>
+          <w:sz w:val="14"/>
+          <w:szCs w:val="14"/>
+        </w:rPr>
+        <w:t xml:space="preserve">      "hasOfferCatalog": {</w:t>
+      </w:r>
+    </w:p>
+    <w:p>
+      <w:pPr>
+        <w:shd w:fill="F4F6F8" w:color="auto" w:val="clear"/>
+        <w:spacing w:after="0" w:before="0" w:line="240"/>
+        <w:ind w:left="120" w:right="120"/>
+      </w:pPr>
+      <w:r>
+        <w:rPr>
+          <w:rFonts w:ascii="Consolas" w:cs="Consolas" w:eastAsia="Consolas" w:hAnsi="Consolas"/>
+          <w:color w:val="1B2733"/>
+          <w:sz w:val="14"/>
+          <w:szCs w:val="14"/>
+        </w:rPr>
+        <w:t xml:space="preserve">        "@type": "OfferCatalog",</w:t>
+      </w:r>
+    </w:p>
+    <w:p>
+      <w:pPr>
+        <w:shd w:fill="F4F6F8" w:color="auto" w:val="clear"/>
+        <w:spacing w:after="0" w:before="0" w:line="240"/>
+        <w:ind w:left="120" w:right="120"/>
+      </w:pPr>
+      <w:r>
+        <w:rPr>
+          <w:rFonts w:ascii="Consolas" w:cs="Consolas" w:eastAsia="Consolas" w:hAnsi="Consolas"/>
+          <w:color w:val="1B2733"/>
+          <w:sz w:val="14"/>
+          <w:szCs w:val="14"/>
+        </w:rPr>
+        <w:t xml:space="preserve">        "@id": "https://buildinginspectionsnearme.com.au/#service-catalog",</w:t>
+      </w:r>
+    </w:p>
+    <w:p>
+      <w:pPr>
+        <w:shd w:fill="F4F6F8" w:color="auto" w:val="clear"/>
+        <w:spacing w:after="0" w:before="0" w:line="240"/>
+        <w:ind w:left="120" w:right="120"/>
+      </w:pPr>
+      <w:r>
+        <w:rPr>
+          <w:rFonts w:ascii="Consolas" w:cs="Consolas" w:eastAsia="Consolas" w:hAnsi="Consolas"/>
+          <w:color w:val="1B2733"/>
+          <w:sz w:val="14"/>
+          <w:szCs w:val="14"/>
+        </w:rPr>
+        <w:t xml:space="preserve">        "name": "Building inspection services",</w:t>
+      </w:r>
+    </w:p>
+    <w:p>
+      <w:pPr>
+        <w:shd w:fill="F4F6F8" w:color="auto" w:val="clear"/>
+        <w:spacing w:after="0" w:before="0" w:line="240"/>
+        <w:ind w:left="120" w:right="120"/>
+      </w:pPr>
+      <w:r>
+        <w:rPr>
+          <w:rFonts w:ascii="Consolas" w:cs="Consolas" w:eastAsia="Consolas" w:hAnsi="Consolas"/>
+          <w:color w:val="1B2733"/>
+          <w:sz w:val="14"/>
+          <w:szCs w:val="14"/>
+        </w:rPr>
+        <w:t xml:space="preserve">        "itemListElement": [</w:t>
+      </w:r>
+    </w:p>
+    <w:p>
+      <w:pPr>
+        <w:shd w:fill="F4F6F8" w:color="auto" w:val="clear"/>
+        <w:spacing w:after="0" w:before="0" w:line="240"/>
+        <w:ind w:left="120" w:right="120"/>
+      </w:pPr>
+      <w:r>
+        <w:rPr>
+          <w:rFonts w:ascii="Consolas" w:cs="Consolas" w:eastAsia="Consolas" w:hAnsi="Consolas"/>
+          <w:color w:val="1B2733"/>
+          <w:sz w:val="14"/>
+          <w:szCs w:val="14"/>
+        </w:rPr>
+        <w:t xml:space="preserve">          {</w:t>
+      </w:r>
+    </w:p>
+    <w:p>
+      <w:pPr>
+        <w:shd w:fill="F4F6F8" w:color="auto" w:val="clear"/>
+        <w:spacing w:after="0" w:before="0" w:line="240"/>
+        <w:ind w:left="120" w:right="120"/>
+      </w:pPr>
+      <w:r>
+        <w:rPr>
+          <w:rFonts w:ascii="Consolas" w:cs="Consolas" w:eastAsia="Consolas" w:hAnsi="Consolas"/>
+          <w:color w:val="1B2733"/>
+          <w:sz w:val="14"/>
+          <w:szCs w:val="14"/>
+        </w:rPr>
+        <w:t xml:space="preserve">            "@type": "Offer",</w:t>
+      </w:r>
+    </w:p>
+    <w:p>
+      <w:pPr>
+        <w:shd w:fill="F4F6F8" w:color="auto" w:val="clear"/>
+        <w:spacing w:after="0" w:before="0" w:line="240"/>
+        <w:ind w:left="120" w:right="120"/>
+      </w:pPr>
+      <w:r>
+        <w:rPr>
+          <w:rFonts w:ascii="Consolas" w:cs="Consolas" w:eastAsia="Consolas" w:hAnsi="Consolas"/>
+          <w:color w:val="1B2733"/>
+          <w:sz w:val="14"/>
+          <w:szCs w:val="14"/>
+        </w:rPr>
+        <w:t xml:space="preserve">            "position": 1,</w:t>
+      </w:r>
+    </w:p>
+    <w:p>
+      <w:pPr>
+        <w:shd w:fill="F4F6F8" w:color="auto" w:val="clear"/>
+        <w:spacing w:after="0" w:before="0" w:line="240"/>
+        <w:ind w:left="120" w:right="120"/>
+      </w:pPr>
+      <w:r>
+        <w:rPr>
+          <w:rFonts w:ascii="Consolas" w:cs="Consolas" w:eastAsia="Consolas" w:hAnsi="Consolas"/>
+          <w:color w:val="1B2733"/>
+          <w:sz w:val="14"/>
+          <w:szCs w:val="14"/>
+        </w:rPr>
+        <w:t xml:space="preserve">            "itemOffered": {</w:t>
+      </w:r>
+    </w:p>
+    <w:p>
+      <w:pPr>
+        <w:shd w:fill="F4F6F8" w:color="auto" w:val="clear"/>
+        <w:spacing w:after="0" w:before="0" w:line="240"/>
+        <w:ind w:left="120" w:right="120"/>
+      </w:pPr>
+      <w:r>
+        <w:rPr>
+          <w:rFonts w:ascii="Consolas" w:cs="Consolas" w:eastAsia="Consolas" w:hAnsi="Consolas"/>
+          <w:color w:val="1B2733"/>
+          <w:sz w:val="14"/>
+          <w:szCs w:val="14"/>
+        </w:rPr>
+        <w:t xml:space="preserve">              "@type": "Service",</w:t>
+      </w:r>
+    </w:p>
+    <w:p>
+      <w:pPr>
+        <w:shd w:fill="F4F6F8" w:color="auto" w:val="clear"/>
+        <w:spacing w:after="0" w:before="0" w:line="240"/>
+        <w:ind w:left="120" w:right="120"/>
+      </w:pPr>
+      <w:r>
+        <w:rPr>
+          <w:rFonts w:ascii="Consolas" w:cs="Consolas" w:eastAsia="Consolas" w:hAnsi="Consolas"/>
+          <w:color w:val="1B2733"/>
+          <w:sz w:val="14"/>
+          <w:szCs w:val="14"/>
+        </w:rPr>
+        <w:t xml:space="preserve">              "@id": "https://buildinginspectionsnearme.com.au/existing-buildings/#service",</w:t>
+      </w:r>
+    </w:p>
+    <w:p>
+      <w:pPr>
+        <w:shd w:fill="F4F6F8" w:color="auto" w:val="clear"/>
+        <w:spacing w:after="0" w:before="0" w:line="240"/>
+        <w:ind w:left="120" w:right="120"/>
+      </w:pPr>
+      <w:r>
+        <w:rPr>
+          <w:rFonts w:ascii="Consolas" w:cs="Consolas" w:eastAsia="Consolas" w:hAnsi="Consolas"/>
+          <w:color w:val="1B2733"/>
+          <w:sz w:val="14"/>
+          <w:szCs w:val="14"/>
+        </w:rPr>
+        <w:t xml:space="preserve">              "name": "Existing Building Inspections",</w:t>
+      </w:r>
+    </w:p>
+    <w:p>
+      <w:pPr>
+        <w:shd w:fill="F4F6F8" w:color="auto" w:val="clear"/>
+        <w:spacing w:after="0" w:before="0" w:line="240"/>
+        <w:ind w:left="120" w:right="120"/>
+      </w:pPr>
+      <w:r>
+        <w:rPr>
+          <w:rFonts w:ascii="Consolas" w:cs="Consolas" w:eastAsia="Consolas" w:hAnsi="Consolas"/>
+          <w:color w:val="1B2733"/>
+          <w:sz w:val="14"/>
+          <w:szCs w:val="14"/>
+        </w:rPr>
+        <w:t xml:space="preserve">              "url": "https://buildinginspectionsnearme.com.au/existing-buildings/"</w:t>
+      </w:r>
+    </w:p>
+    <w:p>
+      <w:pPr>
+        <w:shd w:fill="F4F6F8" w:color="auto" w:val="clear"/>
+        <w:spacing w:after="0" w:before="0" w:line="240"/>
+        <w:ind w:left="120" w:right="120"/>
+      </w:pPr>
+      <w:r>
+        <w:rPr>
+          <w:rFonts w:ascii="Consolas" w:cs="Consolas" w:eastAsia="Consolas" w:hAnsi="Consolas"/>
+          <w:color w:val="1B2733"/>
+          <w:sz w:val="14"/>
+          <w:szCs w:val="14"/>
+        </w:rPr>
+        <w:t xml:space="preserve">            }</w:t>
+      </w:r>
+    </w:p>
+    <w:p>
+      <w:pPr>
+        <w:shd w:fill="F4F6F8" w:color="auto" w:val="clear"/>
+        <w:spacing w:after="0" w:before="0" w:line="240"/>
+        <w:ind w:left="120" w:right="120"/>
+      </w:pPr>
+      <w:r>
+        <w:rPr>
+          <w:rFonts w:ascii="Consolas" w:cs="Consolas" w:eastAsia="Consolas" w:hAnsi="Consolas"/>
+          <w:color w:val="1B2733"/>
+          <w:sz w:val="14"/>
+          <w:szCs w:val="14"/>
+        </w:rPr>
+        <w:t xml:space="preserve">          },</w:t>
+      </w:r>
+    </w:p>
+    <w:p>
+      <w:pPr>
+        <w:shd w:fill="F4F6F8" w:color="auto" w:val="clear"/>
+        <w:spacing w:after="0" w:before="0" w:line="240"/>
+        <w:ind w:left="120" w:right="120"/>
+      </w:pPr>
+      <w:r>
+        <w:rPr>
+          <w:rFonts w:ascii="Consolas" w:cs="Consolas" w:eastAsia="Consolas" w:hAnsi="Consolas"/>
+          <w:color w:val="1B2733"/>
+          <w:sz w:val="14"/>
+          <w:szCs w:val="14"/>
+        </w:rPr>
+        <w:t xml:space="preserve">          {</w:t>
+      </w:r>
+    </w:p>
+    <w:p>
+      <w:pPr>
+        <w:shd w:fill="F4F6F8" w:color="auto" w:val="clear"/>
+        <w:spacing w:after="0" w:before="0" w:line="240"/>
+        <w:ind w:left="120" w:right="120"/>
+      </w:pPr>
+      <w:r>
+        <w:rPr>
+          <w:rFonts w:ascii="Consolas" w:cs="Consolas" w:eastAsia="Consolas" w:hAnsi="Consolas"/>
+          <w:color w:val="1B2733"/>
+          <w:sz w:val="14"/>
+          <w:szCs w:val="14"/>
+        </w:rPr>
+        <w:t xml:space="preserve">            "@type": "Offer",</w:t>
+      </w:r>
+    </w:p>
+    <w:p>
+      <w:pPr>
+        <w:shd w:fill="F4F6F8" w:color="auto" w:val="clear"/>
+        <w:spacing w:after="0" w:before="0" w:line="240"/>
+        <w:ind w:left="120" w:right="120"/>
+      </w:pPr>
+      <w:r>
+        <w:rPr>
+          <w:rFonts w:ascii="Consolas" w:cs="Consolas" w:eastAsia="Consolas" w:hAnsi="Consolas"/>
+          <w:color w:val="1B2733"/>
+          <w:sz w:val="14"/>
+          <w:szCs w:val="14"/>
+        </w:rPr>
+        <w:t xml:space="preserve">            "position": 2,</w:t>
+      </w:r>
+    </w:p>
+    <w:p>
+      <w:pPr>
+        <w:shd w:fill="F4F6F8" w:color="auto" w:val="clear"/>
+        <w:spacing w:after="0" w:before="0" w:line="240"/>
+        <w:ind w:left="120" w:right="120"/>
+      </w:pPr>
+      <w:r>
+        <w:rPr>
+          <w:rFonts w:ascii="Consolas" w:cs="Consolas" w:eastAsia="Consolas" w:hAnsi="Consolas"/>
+          <w:color w:val="1B2733"/>
+          <w:sz w:val="14"/>
+          <w:szCs w:val="14"/>
+        </w:rPr>
+        <w:t xml:space="preserve">            "itemOffered": {</w:t>
+      </w:r>
+    </w:p>
+    <w:p>
+      <w:pPr>
+        <w:shd w:fill="F4F6F8" w:color="auto" w:val="clear"/>
+        <w:spacing w:after="0" w:before="0" w:line="240"/>
+        <w:ind w:left="120" w:right="120"/>
+      </w:pPr>
+      <w:r>
+        <w:rPr>
+          <w:rFonts w:ascii="Consolas" w:cs="Consolas" w:eastAsia="Consolas" w:hAnsi="Consolas"/>
+          <w:color w:val="1B2733"/>
+          <w:sz w:val="14"/>
+          <w:szCs w:val="14"/>
+        </w:rPr>
+        <w:t xml:space="preserve">              "@type": "Service",</w:t>
+      </w:r>
+    </w:p>
+    <w:p>
+      <w:pPr>
+        <w:shd w:fill="F4F6F8" w:color="auto" w:val="clear"/>
+        <w:spacing w:after="0" w:before="0" w:line="240"/>
+        <w:ind w:left="120" w:right="120"/>
+      </w:pPr>
+      <w:r>
+        <w:rPr>
+          <w:rFonts w:ascii="Consolas" w:cs="Consolas" w:eastAsia="Consolas" w:hAnsi="Consolas"/>
+          <w:color w:val="1B2733"/>
+          <w:sz w:val="14"/>
+          <w:szCs w:val="14"/>
+        </w:rPr>
+        <w:t xml:space="preserve">              "@id": "https://buildinginspectionsnearme.com.au/renovations-and-extensions/#service",</w:t>
+      </w:r>
+    </w:p>
+    <w:p>
+      <w:pPr>
+        <w:shd w:fill="F4F6F8" w:color="auto" w:val="clear"/>
+        <w:spacing w:after="0" w:before="0" w:line="240"/>
+        <w:ind w:left="120" w:right="120"/>
+      </w:pPr>
+      <w:r>
+        <w:rPr>
+          <w:rFonts w:ascii="Consolas" w:cs="Consolas" w:eastAsia="Consolas" w:hAnsi="Consolas"/>
+          <w:color w:val="1B2733"/>
+          <w:sz w:val="14"/>
+          <w:szCs w:val="14"/>
+        </w:rPr>
+        <w:t xml:space="preserve">              "name": "Renovation and Extension Inspections",</w:t>
+      </w:r>
+    </w:p>
+    <w:p>
+      <w:pPr>
+        <w:shd w:fill="F4F6F8" w:color="auto" w:val="clear"/>
+        <w:spacing w:after="0" w:before="0" w:line="240"/>
+        <w:ind w:left="120" w:right="120"/>
+      </w:pPr>
+      <w:r>
+        <w:rPr>
+          <w:rFonts w:ascii="Consolas" w:cs="Consolas" w:eastAsia="Consolas" w:hAnsi="Consolas"/>
+          <w:color w:val="1B2733"/>
+          <w:sz w:val="14"/>
+          <w:szCs w:val="14"/>
+        </w:rPr>
+        <w:t xml:space="preserve">              "url": "https://buildinginspectionsnearme.com.au/renovations-and-extensions/"</w:t>
+      </w:r>
+    </w:p>
+    <w:p>
+      <w:pPr>
+        <w:shd w:fill="F4F6F8" w:color="auto" w:val="clear"/>
+        <w:spacing w:after="0" w:before="0" w:line="240"/>
+        <w:ind w:left="120" w:right="120"/>
+      </w:pPr>
+      <w:r>
+        <w:rPr>
+          <w:rFonts w:ascii="Consolas" w:cs="Consolas" w:eastAsia="Consolas" w:hAnsi="Consolas"/>
+          <w:color w:val="1B2733"/>
+          <w:sz w:val="14"/>
+          <w:szCs w:val="14"/>
+        </w:rPr>
+        <w:t xml:space="preserve">            }</w:t>
+      </w:r>
+    </w:p>
+    <w:p>
+      <w:pPr>
+        <w:shd w:fill="F4F6F8" w:color="auto" w:val="clear"/>
+        <w:spacing w:after="0" w:before="0" w:line="240"/>
+        <w:ind w:left="120" w:right="120"/>
+      </w:pPr>
+      <w:r>
+        <w:rPr>
+          <w:rFonts w:ascii="Consolas" w:cs="Consolas" w:eastAsia="Consolas" w:hAnsi="Consolas"/>
+          <w:color w:val="1B2733"/>
+          <w:sz w:val="14"/>
+          <w:szCs w:val="14"/>
+        </w:rPr>
+        <w:t xml:space="preserve">          },</w:t>
+      </w:r>
+    </w:p>
+    <w:p>
+      <w:pPr>
+        <w:shd w:fill="F4F6F8" w:color="auto" w:val="clear"/>
+        <w:spacing w:after="0" w:before="0" w:line="240"/>
+        <w:ind w:left="120" w:right="120"/>
+      </w:pPr>
+      <w:r>
+        <w:rPr>
+          <w:rFonts w:ascii="Consolas" w:cs="Consolas" w:eastAsia="Consolas" w:hAnsi="Consolas"/>
+          <w:color w:val="1B2733"/>
+          <w:sz w:val="14"/>
+          <w:szCs w:val="14"/>
+        </w:rPr>
+        <w:t xml:space="preserve">          {</w:t>
+      </w:r>
+    </w:p>
+    <w:p>
+      <w:pPr>
+        <w:shd w:fill="F4F6F8" w:color="auto" w:val="clear"/>
+        <w:spacing w:after="0" w:before="0" w:line="240"/>
+        <w:ind w:left="120" w:right="120"/>
+      </w:pPr>
+      <w:r>
+        <w:rPr>
+          <w:rFonts w:ascii="Consolas" w:cs="Consolas" w:eastAsia="Consolas" w:hAnsi="Consolas"/>
+          <w:color w:val="1B2733"/>
+          <w:sz w:val="14"/>
+          <w:szCs w:val="14"/>
+        </w:rPr>
+        <w:t xml:space="preserve">            "@type": "Offer",</w:t>
+      </w:r>
+    </w:p>
+    <w:p>
+      <w:pPr>
+        <w:shd w:fill="F4F6F8" w:color="auto" w:val="clear"/>
+        <w:spacing w:after="0" w:before="0" w:line="240"/>
+        <w:ind w:left="120" w:right="120"/>
+      </w:pPr>
+      <w:r>
+        <w:rPr>
+          <w:rFonts w:ascii="Consolas" w:cs="Consolas" w:eastAsia="Consolas" w:hAnsi="Consolas"/>
+          <w:color w:val="1B2733"/>
+          <w:sz w:val="14"/>
+          <w:szCs w:val="14"/>
+        </w:rPr>
+        <w:t xml:space="preserve">            "position": 3,</w:t>
+      </w:r>
+    </w:p>
+    <w:p>
+      <w:pPr>
+        <w:shd w:fill="F4F6F8" w:color="auto" w:val="clear"/>
+        <w:spacing w:after="0" w:before="0" w:line="240"/>
+        <w:ind w:left="120" w:right="120"/>
+      </w:pPr>
+      <w:r>
+        <w:rPr>
+          <w:rFonts w:ascii="Consolas" w:cs="Consolas" w:eastAsia="Consolas" w:hAnsi="Consolas"/>
+          <w:color w:val="1B2733"/>
+          <w:sz w:val="14"/>
+          <w:szCs w:val="14"/>
+        </w:rPr>
+        <w:t xml:space="preserve">            "itemOffered": {</w:t>
+      </w:r>
+    </w:p>
+    <w:p>
+      <w:pPr>
+        <w:shd w:fill="F4F6F8" w:color="auto" w:val="clear"/>
+        <w:spacing w:after="0" w:before="0" w:line="240"/>
+        <w:ind w:left="120" w:right="120"/>
+      </w:pPr>
+      <w:r>
+        <w:rPr>
+          <w:rFonts w:ascii="Consolas" w:cs="Consolas" w:eastAsia="Consolas" w:hAnsi="Consolas"/>
+          <w:color w:val="1B2733"/>
+          <w:sz w:val="14"/>
+          <w:szCs w:val="14"/>
+        </w:rPr>
+        <w:t xml:space="preserve">              "@type": "Service",</w:t>
+      </w:r>
+    </w:p>
+    <w:p>
+      <w:pPr>
+        <w:shd w:fill="F4F6F8" w:color="auto" w:val="clear"/>
+        <w:spacing w:after="0" w:before="0" w:line="240"/>
+        <w:ind w:left="120" w:right="120"/>
+      </w:pPr>
+      <w:r>
+        <w:rPr>
+          <w:rFonts w:ascii="Consolas" w:cs="Consolas" w:eastAsia="Consolas" w:hAnsi="Consolas"/>
+          <w:color w:val="1B2733"/>
+          <w:sz w:val="14"/>
+          <w:szCs w:val="14"/>
+        </w:rPr>
+        <w:t xml:space="preserve">              "@id": "https://buildinginspectionsnearme.com.au/new-buildings/#service",</w:t>
+      </w:r>
+    </w:p>
+    <w:p>
+      <w:pPr>
+        <w:shd w:fill="F4F6F8" w:color="auto" w:val="clear"/>
+        <w:spacing w:after="0" w:before="0" w:line="240"/>
+        <w:ind w:left="120" w:right="120"/>
+      </w:pPr>
+      <w:r>
+        <w:rPr>
+          <w:rFonts w:ascii="Consolas" w:cs="Consolas" w:eastAsia="Consolas" w:hAnsi="Consolas"/>
+          <w:color w:val="1B2733"/>
+          <w:sz w:val="14"/>
+          <w:szCs w:val="14"/>
+        </w:rPr>
+        <w:t xml:space="preserve">              "name": "New Building Inspections",</w:t>
+      </w:r>
+    </w:p>
+    <w:p>
+      <w:pPr>
+        <w:shd w:fill="F4F6F8" w:color="auto" w:val="clear"/>
+        <w:spacing w:after="0" w:before="0" w:line="240"/>
+        <w:ind w:left="120" w:right="120"/>
+      </w:pPr>
+      <w:r>
+        <w:rPr>
+          <w:rFonts w:ascii="Consolas" w:cs="Consolas" w:eastAsia="Consolas" w:hAnsi="Consolas"/>
+          <w:color w:val="1B2733"/>
+          <w:sz w:val="14"/>
+          <w:szCs w:val="14"/>
+        </w:rPr>
+        <w:t xml:space="preserve">              "url": "https://buildinginspectionsnearme.com.au/new-buildings/"</w:t>
+      </w:r>
+    </w:p>
+    <w:p>
+      <w:pPr>
+        <w:shd w:fill="F4F6F8" w:color="auto" w:val="clear"/>
+        <w:spacing w:after="0" w:before="0" w:line="240"/>
+        <w:ind w:left="120" w:right="120"/>
+      </w:pPr>
+      <w:r>
+        <w:rPr>
+          <w:rFonts w:ascii="Consolas" w:cs="Consolas" w:eastAsia="Consolas" w:hAnsi="Consolas"/>
+          <w:color w:val="1B2733"/>
+          <w:sz w:val="14"/>
+          <w:szCs w:val="14"/>
+        </w:rPr>
+        <w:t xml:space="preserve">            }</w:t>
+      </w:r>
+    </w:p>
+    <w:p>
+      <w:pPr>
+        <w:shd w:fill="F4F6F8" w:color="auto" w:val="clear"/>
+        <w:spacing w:after="0" w:before="0" w:line="240"/>
+        <w:ind w:left="120" w:right="120"/>
+      </w:pPr>
+      <w:r>
+        <w:rPr>
+          <w:rFonts w:ascii="Consolas" w:cs="Consolas" w:eastAsia="Consolas" w:hAnsi="Consolas"/>
+          <w:color w:val="1B2733"/>
+          <w:sz w:val="14"/>
+          <w:szCs w:val="14"/>
+        </w:rPr>
+        <w:t xml:space="preserve">          },</w:t>
+      </w:r>
+    </w:p>
+    <w:p>
+      <w:pPr>
+        <w:shd w:fill="F4F6F8" w:color="auto" w:val="clear"/>
+        <w:spacing w:after="0" w:before="0" w:line="240"/>
+        <w:ind w:left="120" w:right="120"/>
+      </w:pPr>
+      <w:r>
+        <w:rPr>
+          <w:rFonts w:ascii="Consolas" w:cs="Consolas" w:eastAsia="Consolas" w:hAnsi="Consolas"/>
+          <w:color w:val="1B2733"/>
+          <w:sz w:val="14"/>
+          <w:szCs w:val="14"/>
+        </w:rPr>
+        <w:t xml:space="preserve">          {</w:t>
+      </w:r>
+    </w:p>
+    <w:p>
+      <w:pPr>
+        <w:shd w:fill="F4F6F8" w:color="auto" w:val="clear"/>
+        <w:spacing w:after="0" w:before="0" w:line="240"/>
+        <w:ind w:left="120" w:right="120"/>
+      </w:pPr>
+      <w:r>
+        <w:rPr>
+          <w:rFonts w:ascii="Consolas" w:cs="Consolas" w:eastAsia="Consolas" w:hAnsi="Consolas"/>
+          <w:color w:val="1B2733"/>
+          <w:sz w:val="14"/>
+          <w:szCs w:val="14"/>
+        </w:rPr>
+        <w:t xml:space="preserve">            "@type": "Offer",</w:t>
+      </w:r>
+    </w:p>
+    <w:p>
+      <w:pPr>
+        <w:shd w:fill="F4F6F8" w:color="auto" w:val="clear"/>
+        <w:spacing w:after="0" w:before="0" w:line="240"/>
+        <w:ind w:left="120" w:right="120"/>
+      </w:pPr>
+      <w:r>
+        <w:rPr>
+          <w:rFonts w:ascii="Consolas" w:cs="Consolas" w:eastAsia="Consolas" w:hAnsi="Consolas"/>
+          <w:color w:val="1B2733"/>
+          <w:sz w:val="14"/>
+          <w:szCs w:val="14"/>
+        </w:rPr>
+        <w:t xml:space="preserve">            "position": 4,</w:t>
+      </w:r>
+    </w:p>
+    <w:p>
+      <w:pPr>
+        <w:shd w:fill="F4F6F8" w:color="auto" w:val="clear"/>
+        <w:spacing w:after="0" w:before="0" w:line="240"/>
+        <w:ind w:left="120" w:right="120"/>
+      </w:pPr>
+      <w:r>
+        <w:rPr>
+          <w:rFonts w:ascii="Consolas" w:cs="Consolas" w:eastAsia="Consolas" w:hAnsi="Consolas"/>
+          <w:color w:val="1B2733"/>
+          <w:sz w:val="14"/>
+          <w:szCs w:val="14"/>
+        </w:rPr>
+        <w:t xml:space="preserve">            "itemOffered": {</w:t>
+      </w:r>
+    </w:p>
+    <w:p>
+      <w:pPr>
+        <w:shd w:fill="F4F6F8" w:color="auto" w:val="clear"/>
+        <w:spacing w:after="0" w:before="0" w:line="240"/>
+        <w:ind w:left="120" w:right="120"/>
+      </w:pPr>
+      <w:r>
+        <w:rPr>
+          <w:rFonts w:ascii="Consolas" w:cs="Consolas" w:eastAsia="Consolas" w:hAnsi="Consolas"/>
+          <w:color w:val="1B2733"/>
+          <w:sz w:val="14"/>
+          <w:szCs w:val="14"/>
+        </w:rPr>
+        <w:t xml:space="preserve">              "@type": "Service",</w:t>
+      </w:r>
+    </w:p>
+    <w:p>
+      <w:pPr>
+        <w:shd w:fill="F4F6F8" w:color="auto" w:val="clear"/>
+        <w:spacing w:after="0" w:before="0" w:line="240"/>
+        <w:ind w:left="120" w:right="120"/>
+      </w:pPr>
+      <w:r>
+        <w:rPr>
+          <w:rFonts w:ascii="Consolas" w:cs="Consolas" w:eastAsia="Consolas" w:hAnsi="Consolas"/>
+          <w:color w:val="1B2733"/>
+          <w:sz w:val="14"/>
+          <w:szCs w:val="14"/>
+        </w:rPr>
+        <w:t xml:space="preserve">              "@id": "https://buildinginspectionsnearme.com.au/adjoining-works-protection/#service",</w:t>
+      </w:r>
+    </w:p>
+    <w:p>
+      <w:pPr>
+        <w:shd w:fill="F4F6F8" w:color="auto" w:val="clear"/>
+        <w:spacing w:after="0" w:before="0" w:line="240"/>
+        <w:ind w:left="120" w:right="120"/>
+      </w:pPr>
+      <w:r>
+        <w:rPr>
+          <w:rFonts w:ascii="Consolas" w:cs="Consolas" w:eastAsia="Consolas" w:hAnsi="Consolas"/>
+          <w:color w:val="1B2733"/>
+          <w:sz w:val="14"/>
+          <w:szCs w:val="14"/>
+        </w:rPr>
+        <w:t xml:space="preserve">              "name": "Adjoining Works Protection and Dilapidation Reporting",</w:t>
+      </w:r>
+    </w:p>
+    <w:p>
+      <w:pPr>
+        <w:shd w:fill="F4F6F8" w:color="auto" w:val="clear"/>
+        <w:spacing w:after="0" w:before="0" w:line="240"/>
+        <w:ind w:left="120" w:right="120"/>
+      </w:pPr>
+      <w:r>
+        <w:rPr>
+          <w:rFonts w:ascii="Consolas" w:cs="Consolas" w:eastAsia="Consolas" w:hAnsi="Consolas"/>
+          <w:color w:val="1B2733"/>
+          <w:sz w:val="14"/>
+          <w:szCs w:val="14"/>
+        </w:rPr>
+        <w:t xml:space="preserve">              "url": "https://buildinginspectionsnearme.com.au/adjoining-works-protection/"</w:t>
+      </w:r>
+    </w:p>
+    <w:p>
+      <w:pPr>
+        <w:shd w:fill="F4F6F8" w:color="auto" w:val="clear"/>
+        <w:spacing w:after="0" w:before="0" w:line="240"/>
+        <w:ind w:left="120" w:right="120"/>
+      </w:pPr>
+      <w:r>
+        <w:rPr>
+          <w:rFonts w:ascii="Consolas" w:cs="Consolas" w:eastAsia="Consolas" w:hAnsi="Consolas"/>
+          <w:color w:val="1B2733"/>
+          <w:sz w:val="14"/>
+          <w:szCs w:val="14"/>
+        </w:rPr>
+        <w:t xml:space="preserve">            }</w:t>
+      </w:r>
+    </w:p>
+    <w:p>
+      <w:pPr>
+        <w:shd w:fill="F4F6F8" w:color="auto" w:val="clear"/>
+        <w:spacing w:after="0" w:before="0" w:line="240"/>
+        <w:ind w:left="120" w:right="120"/>
+      </w:pPr>
+      <w:r>
+        <w:rPr>
+          <w:rFonts w:ascii="Consolas" w:cs="Consolas" w:eastAsia="Consolas" w:hAnsi="Consolas"/>
+          <w:color w:val="1B2733"/>
+          <w:sz w:val="14"/>
+          <w:szCs w:val="14"/>
+        </w:rPr>
+        <w:t xml:space="preserve">          },</w:t>
+      </w:r>
+    </w:p>
+    <w:p>
+      <w:pPr>
+        <w:shd w:fill="F4F6F8" w:color="auto" w:val="clear"/>
+        <w:spacing w:after="0" w:before="0" w:line="240"/>
+        <w:ind w:left="120" w:right="120"/>
+      </w:pPr>
+      <w:r>
+        <w:rPr>
+          <w:rFonts w:ascii="Consolas" w:cs="Consolas" w:eastAsia="Consolas" w:hAnsi="Consolas"/>
+          <w:color w:val="1B2733"/>
+          <w:sz w:val="14"/>
+          <w:szCs w:val="14"/>
+        </w:rPr>
+        <w:t xml:space="preserve">          {</w:t>
+      </w:r>
+    </w:p>
+    <w:p>
+      <w:pPr>
+        <w:shd w:fill="F4F6F8" w:color="auto" w:val="clear"/>
+        <w:spacing w:after="0" w:before="0" w:line="240"/>
+        <w:ind w:left="120" w:right="120"/>
+      </w:pPr>
+      <w:r>
+        <w:rPr>
+          <w:rFonts w:ascii="Consolas" w:cs="Consolas" w:eastAsia="Consolas" w:hAnsi="Consolas"/>
+          <w:color w:val="1B2733"/>
+          <w:sz w:val="14"/>
+          <w:szCs w:val="14"/>
+        </w:rPr>
+        <w:t xml:space="preserve">            "@type": "Offer",</w:t>
+      </w:r>
+    </w:p>
+    <w:p>
+      <w:pPr>
+        <w:shd w:fill="F4F6F8" w:color="auto" w:val="clear"/>
+        <w:spacing w:after="0" w:before="0" w:line="240"/>
+        <w:ind w:left="120" w:right="120"/>
+      </w:pPr>
+      <w:r>
+        <w:rPr>
+          <w:rFonts w:ascii="Consolas" w:cs="Consolas" w:eastAsia="Consolas" w:hAnsi="Consolas"/>
+          <w:color w:val="1B2733"/>
+          <w:sz w:val="14"/>
+          <w:szCs w:val="14"/>
+        </w:rPr>
+        <w:t xml:space="preserve">            "position": 5,</w:t>
+      </w:r>
+    </w:p>
+    <w:p>
+      <w:pPr>
+        <w:shd w:fill="F4F6F8" w:color="auto" w:val="clear"/>
+        <w:spacing w:after="0" w:before="0" w:line="240"/>
+        <w:ind w:left="120" w:right="120"/>
+      </w:pPr>
+      <w:r>
+        <w:rPr>
+          <w:rFonts w:ascii="Consolas" w:cs="Consolas" w:eastAsia="Consolas" w:hAnsi="Consolas"/>
+          <w:color w:val="1B2733"/>
+          <w:sz w:val="14"/>
+          <w:szCs w:val="14"/>
+        </w:rPr>
+        <w:t xml:space="preserve">            "itemOffered": {</w:t>
+      </w:r>
+    </w:p>
+    <w:p>
+      <w:pPr>
+        <w:shd w:fill="F4F6F8" w:color="auto" w:val="clear"/>
+        <w:spacing w:after="0" w:before="0" w:line="240"/>
+        <w:ind w:left="120" w:right="120"/>
+      </w:pPr>
+      <w:r>
+        <w:rPr>
+          <w:rFonts w:ascii="Consolas" w:cs="Consolas" w:eastAsia="Consolas" w:hAnsi="Consolas"/>
+          <w:color w:val="1B2733"/>
+          <w:sz w:val="14"/>
+          <w:szCs w:val="14"/>
+        </w:rPr>
+        <w:t xml:space="preserve">              "@type": "Service",</w:t>
+      </w:r>
+    </w:p>
+    <w:p>
+      <w:pPr>
+        <w:shd w:fill="F4F6F8" w:color="auto" w:val="clear"/>
+        <w:spacing w:after="0" w:before="0" w:line="240"/>
+        <w:ind w:left="120" w:right="120"/>
+      </w:pPr>
+      <w:r>
+        <w:rPr>
+          <w:rFonts w:ascii="Consolas" w:cs="Consolas" w:eastAsia="Consolas" w:hAnsi="Consolas"/>
+          <w:color w:val="1B2733"/>
+          <w:sz w:val="14"/>
+          <w:szCs w:val="14"/>
+        </w:rPr>
+        <w:t xml:space="preserve">              "@id": "https://buildinginspectionsnearme.com.au/pre-purchase-inspection/#service",</w:t>
+      </w:r>
+    </w:p>
+    <w:p>
+      <w:pPr>
+        <w:shd w:fill="F4F6F8" w:color="auto" w:val="clear"/>
+        <w:spacing w:after="0" w:before="0" w:line="240"/>
+        <w:ind w:left="120" w:right="120"/>
+      </w:pPr>
+      <w:r>
+        <w:rPr>
+          <w:rFonts w:ascii="Consolas" w:cs="Consolas" w:eastAsia="Consolas" w:hAnsi="Consolas"/>
+          <w:color w:val="1B2733"/>
+          <w:sz w:val="14"/>
+          <w:szCs w:val="14"/>
+        </w:rPr>
+        <w:t xml:space="preserve">              "name": "Pre-Purchase Building Inspection",</w:t>
+      </w:r>
+    </w:p>
+    <w:p>
+      <w:pPr>
+        <w:shd w:fill="F4F6F8" w:color="auto" w:val="clear"/>
+        <w:spacing w:after="0" w:before="0" w:line="240"/>
+        <w:ind w:left="120" w:right="120"/>
+      </w:pPr>
+      <w:r>
+        <w:rPr>
+          <w:rFonts w:ascii="Consolas" w:cs="Consolas" w:eastAsia="Consolas" w:hAnsi="Consolas"/>
+          <w:color w:val="1B2733"/>
+          <w:sz w:val="14"/>
+          <w:szCs w:val="14"/>
+        </w:rPr>
+        <w:t xml:space="preserve">              "url": "https://buildinginspectionsnearme.com.au/pre-purchase-inspection/"</w:t>
+      </w:r>
+    </w:p>
+    <w:p>
+      <w:pPr>
+        <w:shd w:fill="F4F6F8" w:color="auto" w:val="clear"/>
+        <w:spacing w:after="0" w:before="0" w:line="240"/>
+        <w:ind w:left="120" w:right="120"/>
+      </w:pPr>
+      <w:r>
+        <w:rPr>
+          <w:rFonts w:ascii="Consolas" w:cs="Consolas" w:eastAsia="Consolas" w:hAnsi="Consolas"/>
+          <w:color w:val="1B2733"/>
+          <w:sz w:val="14"/>
+          <w:szCs w:val="14"/>
+        </w:rPr>
+        <w:t xml:space="preserve">            }</w:t>
+      </w:r>
+    </w:p>
+    <w:p>
+      <w:pPr>
+        <w:shd w:fill="F4F6F8" w:color="auto" w:val="clear"/>
+        <w:spacing w:after="0" w:before="0" w:line="240"/>
+        <w:ind w:left="120" w:right="120"/>
+      </w:pPr>
+      <w:r>
+        <w:rPr>
+          <w:rFonts w:ascii="Consolas" w:cs="Consolas" w:eastAsia="Consolas" w:hAnsi="Consolas"/>
+          <w:color w:val="1B2733"/>
+          <w:sz w:val="14"/>
+          <w:szCs w:val="14"/>
+        </w:rPr>
+        <w:t xml:space="preserve">          },</w:t>
+      </w:r>
+    </w:p>
+    <w:p>
+      <w:pPr>
+        <w:shd w:fill="F4F6F8" w:color="auto" w:val="clear"/>
+        <w:spacing w:after="0" w:before="0" w:line="240"/>
+        <w:ind w:left="120" w:right="120"/>
+      </w:pPr>
+      <w:r>
+        <w:rPr>
+          <w:rFonts w:ascii="Consolas" w:cs="Consolas" w:eastAsia="Consolas" w:hAnsi="Consolas"/>
+          <w:color w:val="1B2733"/>
+          <w:sz w:val="14"/>
+          <w:szCs w:val="14"/>
+        </w:rPr>
+        <w:t xml:space="preserve">          {</w:t>
+      </w:r>
+    </w:p>
+    <w:p>
+      <w:pPr>
+        <w:shd w:fill="F4F6F8" w:color="auto" w:val="clear"/>
+        <w:spacing w:after="0" w:before="0" w:line="240"/>
+        <w:ind w:left="120" w:right="120"/>
+      </w:pPr>
+      <w:r>
+        <w:rPr>
+          <w:rFonts w:ascii="Consolas" w:cs="Consolas" w:eastAsia="Consolas" w:hAnsi="Consolas"/>
+          <w:color w:val="1B2733"/>
+          <w:sz w:val="14"/>
+          <w:szCs w:val="14"/>
+        </w:rPr>
+        <w:t xml:space="preserve">            "@type": "Offer",</w:t>
+      </w:r>
+    </w:p>
+    <w:p>
+      <w:pPr>
+        <w:shd w:fill="F4F6F8" w:color="auto" w:val="clear"/>
+        <w:spacing w:after="0" w:before="0" w:line="240"/>
+        <w:ind w:left="120" w:right="120"/>
+      </w:pPr>
+      <w:r>
+        <w:rPr>
+          <w:rFonts w:ascii="Consolas" w:cs="Consolas" w:eastAsia="Consolas" w:hAnsi="Consolas"/>
+          <w:color w:val="1B2733"/>
+          <w:sz w:val="14"/>
+          <w:szCs w:val="14"/>
+        </w:rPr>
+        <w:t xml:space="preserve">            "position": 6,</w:t>
+      </w:r>
+    </w:p>
+    <w:p>
+      <w:pPr>
+        <w:shd w:fill="F4F6F8" w:color="auto" w:val="clear"/>
+        <w:spacing w:after="0" w:before="0" w:line="240"/>
+        <w:ind w:left="120" w:right="120"/>
+      </w:pPr>
+      <w:r>
+        <w:rPr>
+          <w:rFonts w:ascii="Consolas" w:cs="Consolas" w:eastAsia="Consolas" w:hAnsi="Consolas"/>
+          <w:color w:val="1B2733"/>
+          <w:sz w:val="14"/>
+          <w:szCs w:val="14"/>
+        </w:rPr>
+        <w:t xml:space="preserve">            "itemOffered": {</w:t>
+      </w:r>
+    </w:p>
+    <w:p>
+      <w:pPr>
+        <w:shd w:fill="F4F6F8" w:color="auto" w:val="clear"/>
+        <w:spacing w:after="0" w:before="0" w:line="240"/>
+        <w:ind w:left="120" w:right="120"/>
+      </w:pPr>
+      <w:r>
+        <w:rPr>
+          <w:rFonts w:ascii="Consolas" w:cs="Consolas" w:eastAsia="Consolas" w:hAnsi="Consolas"/>
+          <w:color w:val="1B2733"/>
+          <w:sz w:val="14"/>
+          <w:szCs w:val="14"/>
+        </w:rPr>
+        <w:t xml:space="preserve">              "@type": "Service",</w:t>
+      </w:r>
+    </w:p>
+    <w:p>
+      <w:pPr>
+        <w:shd w:fill="F4F6F8" w:color="auto" w:val="clear"/>
+        <w:spacing w:after="0" w:before="0" w:line="240"/>
+        <w:ind w:left="120" w:right="120"/>
+      </w:pPr>
+      <w:r>
+        <w:rPr>
+          <w:rFonts w:ascii="Consolas" w:cs="Consolas" w:eastAsia="Consolas" w:hAnsi="Consolas"/>
+          <w:color w:val="1B2733"/>
+          <w:sz w:val="14"/>
+          <w:szCs w:val="14"/>
+        </w:rPr>
+        <w:t xml:space="preserve">              "@id": "https://buildinginspectionsnearme.com.au/strata-inspection/#service",</w:t>
+      </w:r>
+    </w:p>
+    <w:p>
+      <w:pPr>
+        <w:shd w:fill="F4F6F8" w:color="auto" w:val="clear"/>
+        <w:spacing w:after="0" w:before="0" w:line="240"/>
+        <w:ind w:left="120" w:right="120"/>
+      </w:pPr>
+      <w:r>
+        <w:rPr>
+          <w:rFonts w:ascii="Consolas" w:cs="Consolas" w:eastAsia="Consolas" w:hAnsi="Consolas"/>
+          <w:color w:val="1B2733"/>
+          <w:sz w:val="14"/>
+          <w:szCs w:val="14"/>
+        </w:rPr>
+        <w:t xml:space="preserve">              "name": "Strata Inspection Report",</w:t>
+      </w:r>
+    </w:p>
+    <w:p>
+      <w:pPr>
+        <w:shd w:fill="F4F6F8" w:color="auto" w:val="clear"/>
+        <w:spacing w:after="0" w:before="0" w:line="240"/>
+        <w:ind w:left="120" w:right="120"/>
+      </w:pPr>
+      <w:r>
+        <w:rPr>
+          <w:rFonts w:ascii="Consolas" w:cs="Consolas" w:eastAsia="Consolas" w:hAnsi="Consolas"/>
+          <w:color w:val="1B2733"/>
+          <w:sz w:val="14"/>
+          <w:szCs w:val="14"/>
+        </w:rPr>
+        <w:t xml:space="preserve">              "url": "https://buildinginspectionsnearme.com.au/strata-inspection/"</w:t>
+      </w:r>
+    </w:p>
+    <w:p>
+      <w:pPr>
+        <w:shd w:fill="F4F6F8" w:color="auto" w:val="clear"/>
+        <w:spacing w:after="0" w:before="0" w:line="240"/>
+        <w:ind w:left="120" w:right="120"/>
+      </w:pPr>
+      <w:r>
+        <w:rPr>
+          <w:rFonts w:ascii="Consolas" w:cs="Consolas" w:eastAsia="Consolas" w:hAnsi="Consolas"/>
+          <w:color w:val="1B2733"/>
+          <w:sz w:val="14"/>
+          <w:szCs w:val="14"/>
+        </w:rPr>
+        <w:t xml:space="preserve">            }</w:t>
+      </w:r>
+    </w:p>
+    <w:p>
+      <w:pPr>
+        <w:shd w:fill="F4F6F8" w:color="auto" w:val="clear"/>
+        <w:spacing w:after="0" w:before="0" w:line="240"/>
+        <w:ind w:left="120" w:right="120"/>
+      </w:pPr>
+      <w:r>
+        <w:rPr>
+          <w:rFonts w:ascii="Consolas" w:cs="Consolas" w:eastAsia="Consolas" w:hAnsi="Consolas"/>
+          <w:color w:val="1B2733"/>
+          <w:sz w:val="14"/>
+          <w:szCs w:val="14"/>
+        </w:rPr>
+        <w:t xml:space="preserve">          },</w:t>
+      </w:r>
+    </w:p>
+    <w:p>
+      <w:pPr>
+        <w:shd w:fill="F4F6F8" w:color="auto" w:val="clear"/>
+        <w:spacing w:after="0" w:before="0" w:line="240"/>
+        <w:ind w:left="120" w:right="120"/>
+      </w:pPr>
+      <w:r>
+        <w:rPr>
+          <w:rFonts w:ascii="Consolas" w:cs="Consolas" w:eastAsia="Consolas" w:hAnsi="Consolas"/>
+          <w:color w:val="1B2733"/>
+          <w:sz w:val="14"/>
+          <w:szCs w:val="14"/>
+        </w:rPr>
+        <w:t xml:space="preserve">          {</w:t>
+      </w:r>
+    </w:p>
+    <w:p>
+      <w:pPr>
+        <w:shd w:fill="F4F6F8" w:color="auto" w:val="clear"/>
+        <w:spacing w:after="0" w:before="0" w:line="240"/>
+        <w:ind w:left="120" w:right="120"/>
+      </w:pPr>
+      <w:r>
+        <w:rPr>
+          <w:rFonts w:ascii="Consolas" w:cs="Consolas" w:eastAsia="Consolas" w:hAnsi="Consolas"/>
+          <w:color w:val="1B2733"/>
+          <w:sz w:val="14"/>
+          <w:szCs w:val="14"/>
+        </w:rPr>
+        <w:t xml:space="preserve">            "@type": "Offer",</w:t>
+      </w:r>
+    </w:p>
+    <w:p>
+      <w:pPr>
+        <w:shd w:fill="F4F6F8" w:color="auto" w:val="clear"/>
+        <w:spacing w:after="0" w:before="0" w:line="240"/>
+        <w:ind w:left="120" w:right="120"/>
+      </w:pPr>
+      <w:r>
+        <w:rPr>
+          <w:rFonts w:ascii="Consolas" w:cs="Consolas" w:eastAsia="Consolas" w:hAnsi="Consolas"/>
+          <w:color w:val="1B2733"/>
+          <w:sz w:val="14"/>
+          <w:szCs w:val="14"/>
+        </w:rPr>
+        <w:t xml:space="preserve">            "position": 7,</w:t>
+      </w:r>
+    </w:p>
+    <w:p>
+      <w:pPr>
+        <w:shd w:fill="F4F6F8" w:color="auto" w:val="clear"/>
+        <w:spacing w:after="0" w:before="0" w:line="240"/>
+        <w:ind w:left="120" w:right="120"/>
+      </w:pPr>
+      <w:r>
+        <w:rPr>
+          <w:rFonts w:ascii="Consolas" w:cs="Consolas" w:eastAsia="Consolas" w:hAnsi="Consolas"/>
+          <w:color w:val="1B2733"/>
+          <w:sz w:val="14"/>
+          <w:szCs w:val="14"/>
+        </w:rPr>
+        <w:t xml:space="preserve">            "itemOffered": {</w:t>
+      </w:r>
+    </w:p>
+    <w:p>
+      <w:pPr>
+        <w:shd w:fill="F4F6F8" w:color="auto" w:val="clear"/>
+        <w:spacing w:after="0" w:before="0" w:line="240"/>
+        <w:ind w:left="120" w:right="120"/>
+      </w:pPr>
+      <w:r>
+        <w:rPr>
+          <w:rFonts w:ascii="Consolas" w:cs="Consolas" w:eastAsia="Consolas" w:hAnsi="Consolas"/>
+          <w:color w:val="1B2733"/>
+          <w:sz w:val="14"/>
+          <w:szCs w:val="14"/>
+        </w:rPr>
+        <w:t xml:space="preserve">              "@type": "Service",</w:t>
+      </w:r>
+    </w:p>
+    <w:p>
+      <w:pPr>
+        <w:shd w:fill="F4F6F8" w:color="auto" w:val="clear"/>
+        <w:spacing w:after="0" w:before="0" w:line="240"/>
+        <w:ind w:left="120" w:right="120"/>
+      </w:pPr>
+      <w:r>
+        <w:rPr>
+          <w:rFonts w:ascii="Consolas" w:cs="Consolas" w:eastAsia="Consolas" w:hAnsi="Consolas"/>
+          <w:color w:val="1B2733"/>
+          <w:sz w:val="14"/>
+          <w:szCs w:val="14"/>
+        </w:rPr>
+        <w:t xml:space="preserve">              "@id": "https://buildinginspectionsnearme.com.au/building-insurance-assessment/#service",</w:t>
+      </w:r>
+    </w:p>
+    <w:p>
+      <w:pPr>
+        <w:shd w:fill="F4F6F8" w:color="auto" w:val="clear"/>
+        <w:spacing w:after="0" w:before="0" w:line="240"/>
+        <w:ind w:left="120" w:right="120"/>
+      </w:pPr>
+      <w:r>
+        <w:rPr>
+          <w:rFonts w:ascii="Consolas" w:cs="Consolas" w:eastAsia="Consolas" w:hAnsi="Consolas"/>
+          <w:color w:val="1B2733"/>
+          <w:sz w:val="14"/>
+          <w:szCs w:val="14"/>
+        </w:rPr>
+        <w:t xml:space="preserve">              "name": "Building Insurance Assessment",</w:t>
+      </w:r>
+    </w:p>
+    <w:p>
+      <w:pPr>
+        <w:shd w:fill="F4F6F8" w:color="auto" w:val="clear"/>
+        <w:spacing w:after="0" w:before="0" w:line="240"/>
+        <w:ind w:left="120" w:right="120"/>
+      </w:pPr>
+      <w:r>
+        <w:rPr>
+          <w:rFonts w:ascii="Consolas" w:cs="Consolas" w:eastAsia="Consolas" w:hAnsi="Consolas"/>
+          <w:color w:val="1B2733"/>
+          <w:sz w:val="14"/>
+          <w:szCs w:val="14"/>
+        </w:rPr>
+        <w:t xml:space="preserve">              "url": "https://buildinginspectionsnearme.com.au/building-insurance-assessment/"</w:t>
+      </w:r>
+    </w:p>
+    <w:p>
+      <w:pPr>
+        <w:shd w:fill="F4F6F8" w:color="auto" w:val="clear"/>
+        <w:spacing w:after="0" w:before="0" w:line="240"/>
+        <w:ind w:left="120" w:right="120"/>
+      </w:pPr>
+      <w:r>
+        <w:rPr>
+          <w:rFonts w:ascii="Consolas" w:cs="Consolas" w:eastAsia="Consolas" w:hAnsi="Consolas"/>
+          <w:color w:val="1B2733"/>
+          <w:sz w:val="14"/>
+          <w:szCs w:val="14"/>
+        </w:rPr>
+        <w:t xml:space="preserve">            }</w:t>
+      </w:r>
+    </w:p>
+    <w:p>
+      <w:pPr>
+        <w:shd w:fill="F4F6F8" w:color="auto" w:val="clear"/>
+        <w:spacing w:after="0" w:before="0" w:line="240"/>
+        <w:ind w:left="120" w:right="120"/>
+      </w:pPr>
+      <w:r>
+        <w:rPr>
+          <w:rFonts w:ascii="Consolas" w:cs="Consolas" w:eastAsia="Consolas" w:hAnsi="Consolas"/>
+          <w:color w:val="1B2733"/>
+          <w:sz w:val="14"/>
+          <w:szCs w:val="14"/>
+        </w:rPr>
+        <w:t xml:space="preserve">          },</w:t>
+      </w:r>
+    </w:p>
+    <w:p>
+      <w:pPr>
+        <w:shd w:fill="F4F6F8" w:color="auto" w:val="clear"/>
+        <w:spacing w:after="0" w:before="0" w:line="240"/>
+        <w:ind w:left="120" w:right="120"/>
+      </w:pPr>
+      <w:r>
+        <w:rPr>
+          <w:rFonts w:ascii="Consolas" w:cs="Consolas" w:eastAsia="Consolas" w:hAnsi="Consolas"/>
+          <w:color w:val="1B2733"/>
+          <w:sz w:val="14"/>
+          <w:szCs w:val="14"/>
+        </w:rPr>
+        <w:t xml:space="preserve">          {</w:t>
+      </w:r>
+    </w:p>
+    <w:p>
+      <w:pPr>
+        <w:shd w:fill="F4F6F8" w:color="auto" w:val="clear"/>
+        <w:spacing w:after="0" w:before="0" w:line="240"/>
+        <w:ind w:left="120" w:right="120"/>
+      </w:pPr>
+      <w:r>
+        <w:rPr>
+          <w:rFonts w:ascii="Consolas" w:cs="Consolas" w:eastAsia="Consolas" w:hAnsi="Consolas"/>
+          <w:color w:val="1B2733"/>
+          <w:sz w:val="14"/>
+          <w:szCs w:val="14"/>
+        </w:rPr>
+        <w:t xml:space="preserve">            "@type": "Offer",</w:t>
+      </w:r>
+    </w:p>
+    <w:p>
+      <w:pPr>
+        <w:shd w:fill="F4F6F8" w:color="auto" w:val="clear"/>
+        <w:spacing w:after="0" w:before="0" w:line="240"/>
+        <w:ind w:left="120" w:right="120"/>
+      </w:pPr>
+      <w:r>
+        <w:rPr>
+          <w:rFonts w:ascii="Consolas" w:cs="Consolas" w:eastAsia="Consolas" w:hAnsi="Consolas"/>
+          <w:color w:val="1B2733"/>
+          <w:sz w:val="14"/>
+          <w:szCs w:val="14"/>
+        </w:rPr>
+        <w:t xml:space="preserve">            "position": 8,</w:t>
+      </w:r>
+    </w:p>
+    <w:p>
+      <w:pPr>
+        <w:shd w:fill="F4F6F8" w:color="auto" w:val="clear"/>
+        <w:spacing w:after="0" w:before="0" w:line="240"/>
+        <w:ind w:left="120" w:right="120"/>
+      </w:pPr>
+      <w:r>
+        <w:rPr>
+          <w:rFonts w:ascii="Consolas" w:cs="Consolas" w:eastAsia="Consolas" w:hAnsi="Consolas"/>
+          <w:color w:val="1B2733"/>
+          <w:sz w:val="14"/>
+          <w:szCs w:val="14"/>
+        </w:rPr>
+        <w:t xml:space="preserve">            "itemOffered": {</w:t>
+      </w:r>
+    </w:p>
+    <w:p>
+      <w:pPr>
+        <w:shd w:fill="F4F6F8" w:color="auto" w:val="clear"/>
+        <w:spacing w:after="0" w:before="0" w:line="240"/>
+        <w:ind w:left="120" w:right="120"/>
+      </w:pPr>
+      <w:r>
+        <w:rPr>
+          <w:rFonts w:ascii="Consolas" w:cs="Consolas" w:eastAsia="Consolas" w:hAnsi="Consolas"/>
+          <w:color w:val="1B2733"/>
+          <w:sz w:val="14"/>
+          <w:szCs w:val="14"/>
+        </w:rPr>
+        <w:t xml:space="preserve">              "@type": "Service",</w:t>
+      </w:r>
+    </w:p>
+    <w:p>
+      <w:pPr>
+        <w:shd w:fill="F4F6F8" w:color="auto" w:val="clear"/>
+        <w:spacing w:after="0" w:before="0" w:line="240"/>
+        <w:ind w:left="120" w:right="120"/>
+      </w:pPr>
+      <w:r>
+        <w:rPr>
+          <w:rFonts w:ascii="Consolas" w:cs="Consolas" w:eastAsia="Consolas" w:hAnsi="Consolas"/>
+          <w:color w:val="1B2733"/>
+          <w:sz w:val="14"/>
+          <w:szCs w:val="14"/>
+        </w:rPr>
+        <w:t xml:space="preserve">              "@id": "https://buildinginspectionsnearme.com.au/building-warranty-defect-inspection/#service",</w:t>
+      </w:r>
+    </w:p>
+    <w:p>
+      <w:pPr>
+        <w:shd w:fill="F4F6F8" w:color="auto" w:val="clear"/>
+        <w:spacing w:after="0" w:before="0" w:line="240"/>
+        <w:ind w:left="120" w:right="120"/>
+      </w:pPr>
+      <w:r>
+        <w:rPr>
+          <w:rFonts w:ascii="Consolas" w:cs="Consolas" w:eastAsia="Consolas" w:hAnsi="Consolas"/>
+          <w:color w:val="1B2733"/>
+          <w:sz w:val="14"/>
+          <w:szCs w:val="14"/>
+        </w:rPr>
+        <w:t xml:space="preserve">              "name": "Building Warranty and Defect Inspection",</w:t>
+      </w:r>
+    </w:p>
+    <w:p>
+      <w:pPr>
+        <w:shd w:fill="F4F6F8" w:color="auto" w:val="clear"/>
+        <w:spacing w:after="0" w:before="0" w:line="240"/>
+        <w:ind w:left="120" w:right="120"/>
+      </w:pPr>
+      <w:r>
+        <w:rPr>
+          <w:rFonts w:ascii="Consolas" w:cs="Consolas" w:eastAsia="Consolas" w:hAnsi="Consolas"/>
+          <w:color w:val="1B2733"/>
+          <w:sz w:val="14"/>
+          <w:szCs w:val="14"/>
+        </w:rPr>
+        <w:t xml:space="preserve">              "url": "https://buildinginspectionsnearme.com.au/building-warranty-defect-inspection/"</w:t>
+      </w:r>
+    </w:p>
+    <w:p>
+      <w:pPr>
+        <w:shd w:fill="F4F6F8" w:color="auto" w:val="clear"/>
+        <w:spacing w:after="0" w:before="0" w:line="240"/>
+        <w:ind w:left="120" w:right="120"/>
+      </w:pPr>
+      <w:r>
+        <w:rPr>
+          <w:rFonts w:ascii="Consolas" w:cs="Consolas" w:eastAsia="Consolas" w:hAnsi="Consolas"/>
+          <w:color w:val="1B2733"/>
+          <w:sz w:val="14"/>
+          <w:szCs w:val="14"/>
+        </w:rPr>
+        <w:t xml:space="preserve">            }</w:t>
+      </w:r>
+    </w:p>
+    <w:p>
+      <w:pPr>
+        <w:shd w:fill="F4F6F8" w:color="auto" w:val="clear"/>
+        <w:spacing w:after="0" w:before="0" w:line="240"/>
+        <w:ind w:left="120" w:right="120"/>
+      </w:pPr>
+      <w:r>
+        <w:rPr>
+          <w:rFonts w:ascii="Consolas" w:cs="Consolas" w:eastAsia="Consolas" w:hAnsi="Consolas"/>
+          <w:color w:val="1B2733"/>
+          <w:sz w:val="14"/>
+          <w:szCs w:val="14"/>
+        </w:rPr>
+        <w:t xml:space="preserve">          },</w:t>
+      </w:r>
+    </w:p>
+    <w:p>
+      <w:pPr>
+        <w:shd w:fill="F4F6F8" w:color="auto" w:val="clear"/>
+        <w:spacing w:after="0" w:before="0" w:line="240"/>
+        <w:ind w:left="120" w:right="120"/>
+      </w:pPr>
+      <w:r>
+        <w:rPr>
+          <w:rFonts w:ascii="Consolas" w:cs="Consolas" w:eastAsia="Consolas" w:hAnsi="Consolas"/>
+          <w:color w:val="1B2733"/>
+          <w:sz w:val="14"/>
+          <w:szCs w:val="14"/>
+        </w:rPr>
+        <w:t xml:space="preserve">          {</w:t>
+      </w:r>
+    </w:p>
+    <w:p>
+      <w:pPr>
+        <w:shd w:fill="F4F6F8" w:color="auto" w:val="clear"/>
+        <w:spacing w:after="0" w:before="0" w:line="240"/>
+        <w:ind w:left="120" w:right="120"/>
+      </w:pPr>
+      <w:r>
+        <w:rPr>
+          <w:rFonts w:ascii="Consolas" w:cs="Consolas" w:eastAsia="Consolas" w:hAnsi="Consolas"/>
+          <w:color w:val="1B2733"/>
+          <w:sz w:val="14"/>
+          <w:szCs w:val="14"/>
+        </w:rPr>
+        <w:t xml:space="preserve">            "@type": "Offer",</w:t>
+      </w:r>
+    </w:p>
+    <w:p>
+      <w:pPr>
+        <w:shd w:fill="F4F6F8" w:color="auto" w:val="clear"/>
+        <w:spacing w:after="0" w:before="0" w:line="240"/>
+        <w:ind w:left="120" w:right="120"/>
+      </w:pPr>
+      <w:r>
+        <w:rPr>
+          <w:rFonts w:ascii="Consolas" w:cs="Consolas" w:eastAsia="Consolas" w:hAnsi="Consolas"/>
+          <w:color w:val="1B2733"/>
+          <w:sz w:val="14"/>
+          <w:szCs w:val="14"/>
+        </w:rPr>
+        <w:t xml:space="preserve">            "position": 9,</w:t>
+      </w:r>
+    </w:p>
+    <w:p>
+      <w:pPr>
+        <w:shd w:fill="F4F6F8" w:color="auto" w:val="clear"/>
+        <w:spacing w:after="0" w:before="0" w:line="240"/>
+        <w:ind w:left="120" w:right="120"/>
+      </w:pPr>
+      <w:r>
+        <w:rPr>
+          <w:rFonts w:ascii="Consolas" w:cs="Consolas" w:eastAsia="Consolas" w:hAnsi="Consolas"/>
+          <w:color w:val="1B2733"/>
+          <w:sz w:val="14"/>
+          <w:szCs w:val="14"/>
+        </w:rPr>
+        <w:t xml:space="preserve">            "itemOffered": {</w:t>
+      </w:r>
+    </w:p>
+    <w:p>
+      <w:pPr>
+        <w:shd w:fill="F4F6F8" w:color="auto" w:val="clear"/>
+        <w:spacing w:after="0" w:before="0" w:line="240"/>
+        <w:ind w:left="120" w:right="120"/>
+      </w:pPr>
+      <w:r>
+        <w:rPr>
+          <w:rFonts w:ascii="Consolas" w:cs="Consolas" w:eastAsia="Consolas" w:hAnsi="Consolas"/>
+          <w:color w:val="1B2733"/>
+          <w:sz w:val="14"/>
+          <w:szCs w:val="14"/>
+        </w:rPr>
+        <w:t xml:space="preserve">              "@type": "Service",</w:t>
+      </w:r>
+    </w:p>
+    <w:p>
+      <w:pPr>
+        <w:shd w:fill="F4F6F8" w:color="auto" w:val="clear"/>
+        <w:spacing w:after="0" w:before="0" w:line="240"/>
+        <w:ind w:left="120" w:right="120"/>
+      </w:pPr>
+      <w:r>
+        <w:rPr>
+          <w:rFonts w:ascii="Consolas" w:cs="Consolas" w:eastAsia="Consolas" w:hAnsi="Consolas"/>
+          <w:color w:val="1B2733"/>
+          <w:sz w:val="14"/>
+          <w:szCs w:val="14"/>
+        </w:rPr>
+        <w:t xml:space="preserve">              "@id": "https://buildinginspectionsnearme.com.au/building-and-pest-inspections/#service",</w:t>
+      </w:r>
+    </w:p>
+    <w:p>
+      <w:pPr>
+        <w:shd w:fill="F4F6F8" w:color="auto" w:val="clear"/>
+        <w:spacing w:after="0" w:before="0" w:line="240"/>
+        <w:ind w:left="120" w:right="120"/>
+      </w:pPr>
+      <w:r>
+        <w:rPr>
+          <w:rFonts w:ascii="Consolas" w:cs="Consolas" w:eastAsia="Consolas" w:hAnsi="Consolas"/>
+          <w:color w:val="1B2733"/>
+          <w:sz w:val="14"/>
+          <w:szCs w:val="14"/>
+        </w:rPr>
+        <w:t xml:space="preserve">              "name": "Building and Pest Inspection",</w:t>
+      </w:r>
+    </w:p>
+    <w:p>
+      <w:pPr>
+        <w:shd w:fill="F4F6F8" w:color="auto" w:val="clear"/>
+        <w:spacing w:after="0" w:before="0" w:line="240"/>
+        <w:ind w:left="120" w:right="120"/>
+      </w:pPr>
+      <w:r>
+        <w:rPr>
+          <w:rFonts w:ascii="Consolas" w:cs="Consolas" w:eastAsia="Consolas" w:hAnsi="Consolas"/>
+          <w:color w:val="1B2733"/>
+          <w:sz w:val="14"/>
+          <w:szCs w:val="14"/>
+        </w:rPr>
+        <w:t xml:space="preserve">              "url": "https://buildinginspectionsnearme.com.au/building-and-pest-inspections/"</w:t>
+      </w:r>
+    </w:p>
+    <w:p>
+      <w:pPr>
+        <w:shd w:fill="F4F6F8" w:color="auto" w:val="clear"/>
+        <w:spacing w:after="0" w:before="0" w:line="240"/>
+        <w:ind w:left="120" w:right="120"/>
+      </w:pPr>
+      <w:r>
+        <w:rPr>
+          <w:rFonts w:ascii="Consolas" w:cs="Consolas" w:eastAsia="Consolas" w:hAnsi="Consolas"/>
+          <w:color w:val="1B2733"/>
+          <w:sz w:val="14"/>
+          <w:szCs w:val="14"/>
+        </w:rPr>
+        <w:t xml:space="preserve">            }</w:t>
+      </w:r>
+    </w:p>
+    <w:p>
+      <w:pPr>
+        <w:shd w:fill="F4F6F8" w:color="auto" w:val="clear"/>
+        <w:spacing w:after="0" w:before="0" w:line="240"/>
+        <w:ind w:left="120" w:right="120"/>
+      </w:pPr>
+      <w:r>
+        <w:rPr>
+          <w:rFonts w:ascii="Consolas" w:cs="Consolas" w:eastAsia="Consolas" w:hAnsi="Consolas"/>
+          <w:color w:val="1B2733"/>
+          <w:sz w:val="14"/>
+          <w:szCs w:val="14"/>
+        </w:rPr>
+        <w:t xml:space="preserve">          },</w:t>
+      </w:r>
+    </w:p>
+    <w:p>
+      <w:pPr>
+        <w:shd w:fill="F4F6F8" w:color="auto" w:val="clear"/>
+        <w:spacing w:after="0" w:before="0" w:line="240"/>
+        <w:ind w:left="120" w:right="120"/>
+      </w:pPr>
+      <w:r>
+        <w:rPr>
+          <w:rFonts w:ascii="Consolas" w:cs="Consolas" w:eastAsia="Consolas" w:hAnsi="Consolas"/>
+          <w:color w:val="1B2733"/>
+          <w:sz w:val="14"/>
+          <w:szCs w:val="14"/>
+        </w:rPr>
+        <w:t xml:space="preserve">          {</w:t>
+      </w:r>
+    </w:p>
+    <w:p>
+      <w:pPr>
+        <w:shd w:fill="F4F6F8" w:color="auto" w:val="clear"/>
+        <w:spacing w:after="0" w:before="0" w:line="240"/>
+        <w:ind w:left="120" w:right="120"/>
+      </w:pPr>
+      <w:r>
+        <w:rPr>
+          <w:rFonts w:ascii="Consolas" w:cs="Consolas" w:eastAsia="Consolas" w:hAnsi="Consolas"/>
+          <w:color w:val="1B2733"/>
+          <w:sz w:val="14"/>
+          <w:szCs w:val="14"/>
+        </w:rPr>
+        <w:t xml:space="preserve">            "@type": "Offer",</w:t>
+      </w:r>
+    </w:p>
+    <w:p>
+      <w:pPr>
+        <w:shd w:fill="F4F6F8" w:color="auto" w:val="clear"/>
+        <w:spacing w:after="0" w:before="0" w:line="240"/>
+        <w:ind w:left="120" w:right="120"/>
+      </w:pPr>
+      <w:r>
+        <w:rPr>
+          <w:rFonts w:ascii="Consolas" w:cs="Consolas" w:eastAsia="Consolas" w:hAnsi="Consolas"/>
+          <w:color w:val="1B2733"/>
+          <w:sz w:val="14"/>
+          <w:szCs w:val="14"/>
+        </w:rPr>
+        <w:t xml:space="preserve">            "position": 10,</w:t>
+      </w:r>
+    </w:p>
+    <w:p>
+      <w:pPr>
+        <w:shd w:fill="F4F6F8" w:color="auto" w:val="clear"/>
+        <w:spacing w:after="0" w:before="0" w:line="240"/>
+        <w:ind w:left="120" w:right="120"/>
+      </w:pPr>
+      <w:r>
+        <w:rPr>
+          <w:rFonts w:ascii="Consolas" w:cs="Consolas" w:eastAsia="Consolas" w:hAnsi="Consolas"/>
+          <w:color w:val="1B2733"/>
+          <w:sz w:val="14"/>
+          <w:szCs w:val="14"/>
+        </w:rPr>
+        <w:t xml:space="preserve">            "itemOffered": {</w:t>
+      </w:r>
+    </w:p>
+    <w:p>
+      <w:pPr>
+        <w:shd w:fill="F4F6F8" w:color="auto" w:val="clear"/>
+        <w:spacing w:after="0" w:before="0" w:line="240"/>
+        <w:ind w:left="120" w:right="120"/>
+      </w:pPr>
+      <w:r>
+        <w:rPr>
+          <w:rFonts w:ascii="Consolas" w:cs="Consolas" w:eastAsia="Consolas" w:hAnsi="Consolas"/>
+          <w:color w:val="1B2733"/>
+          <w:sz w:val="14"/>
+          <w:szCs w:val="14"/>
+        </w:rPr>
+        <w:t xml:space="preserve">              "@type": "Service",</w:t>
+      </w:r>
+    </w:p>
+    <w:p>
+      <w:pPr>
+        <w:shd w:fill="F4F6F8" w:color="auto" w:val="clear"/>
+        <w:spacing w:after="0" w:before="0" w:line="240"/>
+        <w:ind w:left="120" w:right="120"/>
+      </w:pPr>
+      <w:r>
+        <w:rPr>
+          <w:rFonts w:ascii="Consolas" w:cs="Consolas" w:eastAsia="Consolas" w:hAnsi="Consolas"/>
+          <w:color w:val="1B2733"/>
+          <w:sz w:val="14"/>
+          <w:szCs w:val="14"/>
+        </w:rPr>
+        <w:t xml:space="preserve">              "@id": "https://buildinginspectionsnearme.com.au/commercial-building-inspections/#service",</w:t>
+      </w:r>
+    </w:p>
+    <w:p>
+      <w:pPr>
+        <w:shd w:fill="F4F6F8" w:color="auto" w:val="clear"/>
+        <w:spacing w:after="0" w:before="0" w:line="240"/>
+        <w:ind w:left="120" w:right="120"/>
+      </w:pPr>
+      <w:r>
+        <w:rPr>
+          <w:rFonts w:ascii="Consolas" w:cs="Consolas" w:eastAsia="Consolas" w:hAnsi="Consolas"/>
+          <w:color w:val="1B2733"/>
+          <w:sz w:val="14"/>
+          <w:szCs w:val="14"/>
+        </w:rPr>
+        <w:t xml:space="preserve">              "name": "Commercial Building Inspection",</w:t>
+      </w:r>
+    </w:p>
+    <w:p>
+      <w:pPr>
+        <w:shd w:fill="F4F6F8" w:color="auto" w:val="clear"/>
+        <w:spacing w:after="0" w:before="0" w:line="240"/>
+        <w:ind w:left="120" w:right="120"/>
+      </w:pPr>
+      <w:r>
+        <w:rPr>
+          <w:rFonts w:ascii="Consolas" w:cs="Consolas" w:eastAsia="Consolas" w:hAnsi="Consolas"/>
+          <w:color w:val="1B2733"/>
+          <w:sz w:val="14"/>
+          <w:szCs w:val="14"/>
+        </w:rPr>
+        <w:t xml:space="preserve">              "url": "https://buildinginspectionsnearme.com.au/commercial-building-inspections/"</w:t>
+      </w:r>
+    </w:p>
+    <w:p>
+      <w:pPr>
+        <w:shd w:fill="F4F6F8" w:color="auto" w:val="clear"/>
+        <w:spacing w:after="0" w:before="0" w:line="240"/>
+        <w:ind w:left="120" w:right="120"/>
+      </w:pPr>
+      <w:r>
+        <w:rPr>
+          <w:rFonts w:ascii="Consolas" w:cs="Consolas" w:eastAsia="Consolas" w:hAnsi="Consolas"/>
+          <w:color w:val="1B2733"/>
+          <w:sz w:val="14"/>
+          <w:szCs w:val="14"/>
+        </w:rPr>
+        <w:t xml:space="preserve">            }</w:t>
+      </w:r>
+    </w:p>
+    <w:p>
+      <w:pPr>
+        <w:shd w:fill="F4F6F8" w:color="auto" w:val="clear"/>
+        <w:spacing w:after="0" w:before="0" w:line="240"/>
+        <w:ind w:left="120" w:right="120"/>
+      </w:pPr>
+      <w:r>
+        <w:rPr>
+          <w:rFonts w:ascii="Consolas" w:cs="Consolas" w:eastAsia="Consolas" w:hAnsi="Consolas"/>
+          <w:color w:val="1B2733"/>
+          <w:sz w:val="14"/>
+          <w:szCs w:val="14"/>
+        </w:rPr>
+        <w:t xml:space="preserve">          },</w:t>
+      </w:r>
+    </w:p>
+    <w:p>
+      <w:pPr>
+        <w:shd w:fill="F4F6F8" w:color="auto" w:val="clear"/>
+        <w:spacing w:after="0" w:before="0" w:line="240"/>
+        <w:ind w:left="120" w:right="120"/>
+      </w:pPr>
+      <w:r>
+        <w:rPr>
+          <w:rFonts w:ascii="Consolas" w:cs="Consolas" w:eastAsia="Consolas" w:hAnsi="Consolas"/>
+          <w:color w:val="1B2733"/>
+          <w:sz w:val="14"/>
+          <w:szCs w:val="14"/>
+        </w:rPr>
+        <w:t xml:space="preserve">          {</w:t>
+      </w:r>
+    </w:p>
+    <w:p>
+      <w:pPr>
+        <w:shd w:fill="F4F6F8" w:color="auto" w:val="clear"/>
+        <w:spacing w:after="0" w:before="0" w:line="240"/>
+        <w:ind w:left="120" w:right="120"/>
+      </w:pPr>
+      <w:r>
+        <w:rPr>
+          <w:rFonts w:ascii="Consolas" w:cs="Consolas" w:eastAsia="Consolas" w:hAnsi="Consolas"/>
+          <w:color w:val="1B2733"/>
+          <w:sz w:val="14"/>
+          <w:szCs w:val="14"/>
+        </w:rPr>
+        <w:t xml:space="preserve">            "@type": "Offer",</w:t>
+      </w:r>
+    </w:p>
+    <w:p>
+      <w:pPr>
+        <w:shd w:fill="F4F6F8" w:color="auto" w:val="clear"/>
+        <w:spacing w:after="0" w:before="0" w:line="240"/>
+        <w:ind w:left="120" w:right="120"/>
+      </w:pPr>
+      <w:r>
+        <w:rPr>
+          <w:rFonts w:ascii="Consolas" w:cs="Consolas" w:eastAsia="Consolas" w:hAnsi="Consolas"/>
+          <w:color w:val="1B2733"/>
+          <w:sz w:val="14"/>
+          <w:szCs w:val="14"/>
+        </w:rPr>
+        <w:t xml:space="preserve">            "position": 11,</w:t>
+      </w:r>
+    </w:p>
+    <w:p>
+      <w:pPr>
+        <w:shd w:fill="F4F6F8" w:color="auto" w:val="clear"/>
+        <w:spacing w:after="0" w:before="0" w:line="240"/>
+        <w:ind w:left="120" w:right="120"/>
+      </w:pPr>
+      <w:r>
+        <w:rPr>
+          <w:rFonts w:ascii="Consolas" w:cs="Consolas" w:eastAsia="Consolas" w:hAnsi="Consolas"/>
+          <w:color w:val="1B2733"/>
+          <w:sz w:val="14"/>
+          <w:szCs w:val="14"/>
+        </w:rPr>
+        <w:t xml:space="preserve">            "itemOffered": {</w:t>
+      </w:r>
+    </w:p>
+    <w:p>
+      <w:pPr>
+        <w:shd w:fill="F4F6F8" w:color="auto" w:val="clear"/>
+        <w:spacing w:after="0" w:before="0" w:line="240"/>
+        <w:ind w:left="120" w:right="120"/>
+      </w:pPr>
+      <w:r>
+        <w:rPr>
+          <w:rFonts w:ascii="Consolas" w:cs="Consolas" w:eastAsia="Consolas" w:hAnsi="Consolas"/>
+          <w:color w:val="1B2733"/>
+          <w:sz w:val="14"/>
+          <w:szCs w:val="14"/>
+        </w:rPr>
+        <w:t xml:space="preserve">              "@type": "Service",</w:t>
+      </w:r>
+    </w:p>
+    <w:p>
+      <w:pPr>
+        <w:shd w:fill="F4F6F8" w:color="auto" w:val="clear"/>
+        <w:spacing w:after="0" w:before="0" w:line="240"/>
+        <w:ind w:left="120" w:right="120"/>
+      </w:pPr>
+      <w:r>
+        <w:rPr>
+          <w:rFonts w:ascii="Consolas" w:cs="Consolas" w:eastAsia="Consolas" w:hAnsi="Consolas"/>
+          <w:color w:val="1B2733"/>
+          <w:sz w:val="14"/>
+          <w:szCs w:val="14"/>
+        </w:rPr>
+        <w:t xml:space="preserve">              "@id": "https://buildinginspectionsnearme.com.au/pre-auction-building-inspection/#service",</w:t>
+      </w:r>
+    </w:p>
+    <w:p>
+      <w:pPr>
+        <w:shd w:fill="F4F6F8" w:color="auto" w:val="clear"/>
+        <w:spacing w:after="0" w:before="0" w:line="240"/>
+        <w:ind w:left="120" w:right="120"/>
+      </w:pPr>
+      <w:r>
+        <w:rPr>
+          <w:rFonts w:ascii="Consolas" w:cs="Consolas" w:eastAsia="Consolas" w:hAnsi="Consolas"/>
+          <w:color w:val="1B2733"/>
+          <w:sz w:val="14"/>
+          <w:szCs w:val="14"/>
+        </w:rPr>
+        <w:t xml:space="preserve">              "name": "Pre-Auction Building Inspection",</w:t>
+      </w:r>
+    </w:p>
+    <w:p>
+      <w:pPr>
+        <w:shd w:fill="F4F6F8" w:color="auto" w:val="clear"/>
+        <w:spacing w:after="0" w:before="0" w:line="240"/>
+        <w:ind w:left="120" w:right="120"/>
+      </w:pPr>
+      <w:r>
+        <w:rPr>
+          <w:rFonts w:ascii="Consolas" w:cs="Consolas" w:eastAsia="Consolas" w:hAnsi="Consolas"/>
+          <w:color w:val="1B2733"/>
+          <w:sz w:val="14"/>
+          <w:szCs w:val="14"/>
+        </w:rPr>
+        <w:t xml:space="preserve">              "url": "https://buildinginspectionsnearme.com.au/pre-auction-building-inspection/"</w:t>
+      </w:r>
+    </w:p>
+    <w:p>
+      <w:pPr>
+        <w:shd w:fill="F4F6F8" w:color="auto" w:val="clear"/>
+        <w:spacing w:after="0" w:before="0" w:line="240"/>
+        <w:ind w:left="120" w:right="120"/>
+      </w:pPr>
+      <w:r>
+        <w:rPr>
+          <w:rFonts w:ascii="Consolas" w:cs="Consolas" w:eastAsia="Consolas" w:hAnsi="Consolas"/>
+          <w:color w:val="1B2733"/>
+          <w:sz w:val="14"/>
+          <w:szCs w:val="14"/>
+        </w:rPr>
+        <w:t xml:space="preserve">            }</w:t>
+      </w:r>
+    </w:p>
+    <w:p>
+      <w:pPr>
+        <w:shd w:fill="F4F6F8" w:color="auto" w:val="clear"/>
+        <w:spacing w:after="0" w:before="0" w:line="240"/>
+        <w:ind w:left="120" w:right="120"/>
+      </w:pPr>
+      <w:r>
+        <w:rPr>
+          <w:rFonts w:ascii="Consolas" w:cs="Consolas" w:eastAsia="Consolas" w:hAnsi="Consolas"/>
+          <w:color w:val="1B2733"/>
+          <w:sz w:val="14"/>
+          <w:szCs w:val="14"/>
+        </w:rPr>
+        <w:t xml:space="preserve">          }</w:t>
+      </w:r>
+    </w:p>
+    <w:p>
+      <w:pPr>
+        <w:shd w:fill="F4F6F8" w:color="auto" w:val="clear"/>
+        <w:spacing w:after="0" w:before="0" w:line="240"/>
+        <w:ind w:left="120" w:right="120"/>
+      </w:pPr>
+      <w:r>
+        <w:rPr>
+          <w:rFonts w:ascii="Consolas" w:cs="Consolas" w:eastAsia="Consolas" w:hAnsi="Consolas"/>
+          <w:color w:val="1B2733"/>
+          <w:sz w:val="14"/>
+          <w:szCs w:val="14"/>
+        </w:rPr>
+        <w:t xml:space="preserve">        ]</w:t>
+      </w:r>
+    </w:p>
+    <w:p>
+      <w:pPr>
+        <w:shd w:fill="F4F6F8" w:color="auto" w:val="clear"/>
+        <w:spacing w:after="0" w:before="0" w:line="240"/>
+        <w:ind w:left="120" w:right="120"/>
+      </w:pPr>
+      <w:r>
+        <w:rPr>
+          <w:rFonts w:ascii="Consolas" w:cs="Consolas" w:eastAsia="Consolas" w:hAnsi="Consolas"/>
+          <w:color w:val="1B2733"/>
+          <w:sz w:val="14"/>
+          <w:szCs w:val="14"/>
+        </w:rPr>
+        <w:t xml:space="preserve">      }</w:t>
+      </w:r>
+    </w:p>
+    <w:p>
+      <w:pPr>
+        <w:shd w:fill="F4F6F8" w:color="auto" w:val="clear"/>
+        <w:spacing w:after="0" w:before="0" w:line="240"/>
+        <w:ind w:left="120" w:right="120"/>
+      </w:pPr>
+      <w:r>
+        <w:rPr>
+          <w:rFonts w:ascii="Consolas" w:cs="Consolas" w:eastAsia="Consolas" w:hAnsi="Consolas"/>
+          <w:color w:val="1B2733"/>
+          <w:sz w:val="14"/>
+          <w:szCs w:val="14"/>
+        </w:rPr>
+        <w:t xml:space="preserve">    },</w:t>
+      </w:r>
+    </w:p>
+    <w:p>
+      <w:pPr>
+        <w:shd w:fill="F4F6F8" w:color="auto" w:val="clear"/>
+        <w:spacing w:after="0" w:before="0" w:line="240"/>
+        <w:ind w:left="120" w:right="120"/>
+      </w:pPr>
+      <w:r>
+        <w:rPr>
+          <w:rFonts w:ascii="Consolas" w:cs="Consolas" w:eastAsia="Consolas" w:hAnsi="Consolas"/>
+          <w:color w:val="1B2733"/>
+          <w:sz w:val="14"/>
+          <w:szCs w:val="14"/>
+        </w:rPr>
+        <w:t xml:space="preserve">    {</w:t>
+      </w:r>
+    </w:p>
+    <w:p>
+      <w:pPr>
+        <w:shd w:fill="F4F6F8" w:color="auto" w:val="clear"/>
+        <w:spacing w:after="0" w:before="0" w:line="240"/>
+        <w:ind w:left="120" w:right="120"/>
+      </w:pPr>
+      <w:r>
+        <w:rPr>
+          <w:rFonts w:ascii="Consolas" w:cs="Consolas" w:eastAsia="Consolas" w:hAnsi="Consolas"/>
+          <w:color w:val="1B2733"/>
+          <w:sz w:val="14"/>
+          <w:szCs w:val="14"/>
+        </w:rPr>
+        <w:t xml:space="preserve">      "@type": "WebSite",</w:t>
+      </w:r>
+    </w:p>
+    <w:p>
+      <w:pPr>
+        <w:shd w:fill="F4F6F8" w:color="auto" w:val="clear"/>
+        <w:spacing w:after="0" w:before="0" w:line="240"/>
+        <w:ind w:left="120" w:right="120"/>
+      </w:pPr>
+      <w:r>
+        <w:rPr>
+          <w:rFonts w:ascii="Consolas" w:cs="Consolas" w:eastAsia="Consolas" w:hAnsi="Consolas"/>
+          <w:color w:val="1B2733"/>
+          <w:sz w:val="14"/>
+          <w:szCs w:val="14"/>
+        </w:rPr>
+        <w:t xml:space="preserve">      "@id": "https://buildinginspectionsnearme.com.au/#website",</w:t>
+      </w:r>
+    </w:p>
+    <w:p>
+      <w:pPr>
+        <w:shd w:fill="F4F6F8" w:color="auto" w:val="clear"/>
+        <w:spacing w:after="0" w:before="0" w:line="240"/>
+        <w:ind w:left="120" w:right="120"/>
+      </w:pPr>
+      <w:r>
+        <w:rPr>
+          <w:rFonts w:ascii="Consolas" w:cs="Consolas" w:eastAsia="Consolas" w:hAnsi="Consolas"/>
+          <w:color w:val="1B2733"/>
+          <w:sz w:val="14"/>
+          <w:szCs w:val="14"/>
+        </w:rPr>
+        <w:t xml:space="preserve">      "url": "https://buildinginspectionsnearme.com.au/",</w:t>
+      </w:r>
+    </w:p>
+    <w:p>
+      <w:pPr>
+        <w:shd w:fill="F4F6F8" w:color="auto" w:val="clear"/>
+        <w:spacing w:after="0" w:before="0" w:line="240"/>
+        <w:ind w:left="120" w:right="120"/>
+      </w:pPr>
+      <w:r>
+        <w:rPr>
+          <w:rFonts w:ascii="Consolas" w:cs="Consolas" w:eastAsia="Consolas" w:hAnsi="Consolas"/>
+          <w:color w:val="1B2733"/>
+          <w:sz w:val="14"/>
+          <w:szCs w:val="14"/>
+        </w:rPr>
+        <w:t xml:space="preserve">      "name": "Building Inspections Near Me",</w:t>
+      </w:r>
+    </w:p>
+    <w:p>
+      <w:pPr>
+        <w:shd w:fill="F4F6F8" w:color="auto" w:val="clear"/>
+        <w:spacing w:after="0" w:before="0" w:line="240"/>
+        <w:ind w:left="120" w:right="120"/>
+      </w:pPr>
+      <w:r>
+        <w:rPr>
+          <w:rFonts w:ascii="Consolas" w:cs="Consolas" w:eastAsia="Consolas" w:hAnsi="Consolas"/>
+          <w:color w:val="1B2733"/>
+          <w:sz w:val="14"/>
+          <w:szCs w:val="14"/>
+        </w:rPr>
+        <w:t xml:space="preserve">      "inLanguage": "en-AU",</w:t>
+      </w:r>
+    </w:p>
+    <w:p>
+      <w:pPr>
+        <w:shd w:fill="F4F6F8" w:color="auto" w:val="clear"/>
+        <w:spacing w:after="0" w:before="0" w:line="240"/>
+        <w:ind w:left="120" w:right="120"/>
+      </w:pPr>
+      <w:r>
+        <w:rPr>
+          <w:rFonts w:ascii="Consolas" w:cs="Consolas" w:eastAsia="Consolas" w:hAnsi="Consolas"/>
+          <w:color w:val="1B2733"/>
+          <w:sz w:val="14"/>
+          <w:szCs w:val="14"/>
+        </w:rPr>
+        <w:t xml:space="preserve">      "publisher": {</w:t>
+      </w:r>
+    </w:p>
+    <w:p>
+      <w:pPr>
+        <w:shd w:fill="F4F6F8" w:color="auto" w:val="clear"/>
+        <w:spacing w:after="0" w:before="0" w:line="240"/>
+        <w:ind w:left="120" w:right="120"/>
+      </w:pPr>
+      <w:r>
+        <w:rPr>
+          <w:rFonts w:ascii="Consolas" w:cs="Consolas" w:eastAsia="Consolas" w:hAnsi="Consolas"/>
+          <w:color w:val="1B2733"/>
+          <w:sz w:val="14"/>
+          <w:szCs w:val="14"/>
+        </w:rPr>
+        <w:t xml:space="preserve">        "@id": "https://buildinginspectionsnearme.com.au/#organization"</w:t>
+      </w:r>
+    </w:p>
+    <w:p>
+      <w:pPr>
+        <w:shd w:fill="F4F6F8" w:color="auto" w:val="clear"/>
+        <w:spacing w:after="0" w:before="0" w:line="240"/>
+        <w:ind w:left="120" w:right="120"/>
+      </w:pPr>
+      <w:r>
+        <w:rPr>
+          <w:rFonts w:ascii="Consolas" w:cs="Consolas" w:eastAsia="Consolas" w:hAnsi="Consolas"/>
+          <w:color w:val="1B2733"/>
+          <w:sz w:val="14"/>
+          <w:szCs w:val="14"/>
+        </w:rPr>
+        <w:t xml:space="preserve">      }</w:t>
+      </w:r>
+    </w:p>
+    <w:p>
+      <w:pPr>
+        <w:shd w:fill="F4F6F8" w:color="auto" w:val="clear"/>
+        <w:spacing w:after="0" w:before="0" w:line="240"/>
+        <w:ind w:left="120" w:right="120"/>
+      </w:pPr>
+      <w:r>
+        <w:rPr>
+          <w:rFonts w:ascii="Consolas" w:cs="Consolas" w:eastAsia="Consolas" w:hAnsi="Consolas"/>
+          <w:color w:val="1B2733"/>
+          <w:sz w:val="14"/>
+          <w:szCs w:val="14"/>
+        </w:rPr>
+        <w:t xml:space="preserve">    },</w:t>
+      </w:r>
+    </w:p>
+    <w:p>
+      <w:pPr>
+        <w:shd w:fill="F4F6F8" w:color="auto" w:val="clear"/>
+        <w:spacing w:after="0" w:before="0" w:line="240"/>
+        <w:ind w:left="120" w:right="120"/>
+      </w:pPr>
+      <w:r>
+        <w:rPr>
+          <w:rFonts w:ascii="Consolas" w:cs="Consolas" w:eastAsia="Consolas" w:hAnsi="Consolas"/>
+          <w:color w:val="1B2733"/>
+          <w:sz w:val="14"/>
+          <w:szCs w:val="14"/>
+        </w:rPr>
+        <w:t xml:space="preserve">    {</w:t>
+      </w:r>
+    </w:p>
+    <w:p>
+      <w:pPr>
+        <w:shd w:fill="F4F6F8" w:color="auto" w:val="clear"/>
+        <w:spacing w:after="0" w:before="0" w:line="240"/>
+        <w:ind w:left="120" w:right="120"/>
+      </w:pPr>
+      <w:r>
+        <w:rPr>
+          <w:rFonts w:ascii="Consolas" w:cs="Consolas" w:eastAsia="Consolas" w:hAnsi="Consolas"/>
+          <w:color w:val="1B2733"/>
+          <w:sz w:val="14"/>
+          <w:szCs w:val="14"/>
+        </w:rPr>
         <w:t xml:space="preserve">      "@type": "WebPage",</w:t>
       </w:r>
     </w:p>
@@ -3945,7 +6873,7 @@
           <w:sz w:val="25"/>
           <w:szCs w:val="25"/>
         </w:rPr>
-        <w:t xml:space="preserve">Inclusions listed in the markup</w:t>
+        <w:t xml:space="preserve">Local business details carried on this page</w:t>
       </w:r>
     </w:p>
     <w:p>
@@ -3963,7 +6891,7 @@
           <w:sz w:val="21"/>
           <w:szCs w:val="21"/>
         </w:rPr>
-        <w:t xml:space="preserve">These appear as the page's OfferCatalog. They should match the inclusions published on the page.</w:t>
+        <w:t xml:space="preserve">This block includes the business itself, so the page stands alone. The same details appear on all eleven service pages under one shared @id.</w:t>
       </w:r>
     </w:p>
     <w:p>
@@ -3982,7 +6910,7 @@
           <w:sz w:val="21"/>
           <w:szCs w:val="21"/>
         </w:rPr>
-        <w:t xml:space="preserve">Adjoining property condition (dilapidation) survey</w:t>
+        <w:t xml:space="preserve">Name: Building Inspections Near Me (BINM)</w:t>
       </w:r>
     </w:p>
     <w:p>
@@ -4001,7 +6929,7 @@
           <w:sz w:val="21"/>
           <w:szCs w:val="21"/>
         </w:rPr>
-        <w:t xml:space="preserve">Protection works assessment of proposed methodology, drawings, services and drainage</w:t>
+        <w:t xml:space="preserve">Type: HomeAndConstructionBusiness, ProfessionalService — both LocalBusiness subtypes</w:t>
       </w:r>
     </w:p>
     <w:p>
@@ -4020,7 +6948,7 @@
           <w:sz w:val="21"/>
           <w:szCs w:val="21"/>
         </w:rPr>
-        <w:t xml:space="preserve">Protection works documentation support for permit and notice readiness</w:t>
+        <w:t xml:space="preserve">@id: https://buildinginspectionsnearme.com.au/#organization (identical on every page)</w:t>
       </w:r>
     </w:p>
     <w:p>
@@ -4039,7 +6967,7 @@
           <w:sz w:val="21"/>
           <w:szCs w:val="21"/>
         </w:rPr>
-        <w:t xml:space="preserve">Construction monitoring, milestone-based or periodic</w:t>
+        <w:t xml:space="preserve">Phone: +61-1800-796-776</w:t>
       </w:r>
     </w:p>
     <w:p>
@@ -4058,7 +6986,7 @@
           <w:sz w:val="21"/>
           <w:szCs w:val="21"/>
         </w:rPr>
-        <w:t xml:space="preserve">Crack monitoring using tell-tales</w:t>
+        <w:t xml:space="preserve">Price range: From $495 inc. GST</w:t>
       </w:r>
     </w:p>
     <w:p>
@@ -4077,7 +7005,7 @@
           <w:sz w:val="21"/>
           <w:szCs w:val="21"/>
         </w:rPr>
-        <w:t xml:space="preserve">Level survey and contour baseline with repeat surveys</w:t>
+        <w:t xml:space="preserve">Area served: Australia, Melbourne, Sydney, Brisbane, Adelaide</w:t>
       </w:r>
     </w:p>
     <w:p>
@@ -4096,7 +7024,7 @@
           <w:sz w:val="21"/>
           <w:szCs w:val="21"/>
         </w:rPr>
-        <w:t xml:space="preserve">Instrumentation coordination</w:t>
+        <w:t xml:space="preserve">Also lists all 11 services via hasOfferCatalog.</w:t>
       </w:r>
     </w:p>
     <w:p>
@@ -4115,7 +7043,45 @@
           <w:sz w:val="21"/>
           <w:szCs w:val="21"/>
         </w:rPr>
-        <w:t xml:space="preserve">Post-works comparison condition survey</w:t>
+        <w:t xml:space="preserve">Not included (no published source): geo, logo, image, email, openingHoursSpecification, sameAs. Without an address this is not a complete Google LocalBusiness entry; add them to business-profile.json and regenerate once they exist.</w:t>
+      </w:r>
+    </w:p>
+    <w:p>
+      <w:pPr>
+        <w:pStyle w:val="Heading2"/>
+        <w:pBdr>
+          <w:bottom w:val="single" w:color="D6DCE4" w:sz="6" w:space="6"/>
+        </w:pBdr>
+        <w:spacing w:after="140" w:before="320"/>
+      </w:pPr>
+      <w:r>
+        <w:rPr>
+          <w:rFonts w:ascii="Calibri" w:cs="Calibri" w:eastAsia="Calibri" w:hAnsi="Calibri"/>
+          <w:b/>
+          <w:bCs/>
+          <w:color w:val="0B2C5A"/>
+          <w:sz w:val="25"/>
+          <w:szCs w:val="25"/>
+        </w:rPr>
+        <w:t xml:space="preserve">Inclusions listed in the markup</w:t>
+      </w:r>
+    </w:p>
+    <w:p>
+      <w:pPr>
+        <w:spacing w:after="160"/>
+      </w:pPr>
+      <w:r>
+        <w:rPr>
+          <w:rFonts w:ascii="Calibri" w:cs="Calibri" w:eastAsia="Calibri" w:hAnsi="Calibri"/>
+          <w:b w:val="false"/>
+          <w:bCs w:val="false"/>
+          <w:i w:val="false"/>
+          <w:iCs w:val="false"/>
+          <w:color w:val="5A6472"/>
+          <w:sz w:val="21"/>
+          <w:szCs w:val="21"/>
+        </w:rPr>
+        <w:t xml:space="preserve">These appear as the page's OfferCatalog. They should match the inclusions published on the page.</w:t>
       </w:r>
     </w:p>
     <w:p>
@@ -4134,7 +7100,7 @@
           <w:sz w:val="21"/>
           <w:szCs w:val="21"/>
         </w:rPr>
-        <w:t xml:space="preserve">Damage triage and make-safe advice</w:t>
+        <w:t xml:space="preserve">Adjoining property condition (dilapidation) survey</w:t>
       </w:r>
     </w:p>
     <w:p>
@@ -4153,7 +7119,7 @@
           <w:sz w:val="21"/>
           <w:szCs w:val="21"/>
         </w:rPr>
-        <w:t xml:space="preserve">Engineering inspection and causation report</w:t>
+        <w:t xml:space="preserve">Protection works assessment of proposed methodology, drawings, services and drainage</w:t>
       </w:r>
     </w:p>
     <w:p>
@@ -4172,6 +7138,158 @@
           <w:sz w:val="21"/>
           <w:szCs w:val="21"/>
         </w:rPr>
+        <w:t xml:space="preserve">Protection works documentation support for permit and notice readiness</w:t>
+      </w:r>
+    </w:p>
+    <w:p>
+      <w:pPr>
+        <w:pStyle w:val="ListParagraph"/>
+        <w:numPr>
+          <w:ilvl w:val="0"/>
+          <w:numId w:val="1"/>
+        </w:numPr>
+        <w:spacing w:after="90"/>
+      </w:pPr>
+      <w:r>
+        <w:rPr>
+          <w:rFonts w:ascii="Calibri" w:cs="Calibri" w:eastAsia="Calibri" w:hAnsi="Calibri"/>
+          <w:color w:val="222222"/>
+          <w:sz w:val="21"/>
+          <w:szCs w:val="21"/>
+        </w:rPr>
+        <w:t xml:space="preserve">Construction monitoring, milestone-based or periodic</w:t>
+      </w:r>
+    </w:p>
+    <w:p>
+      <w:pPr>
+        <w:pStyle w:val="ListParagraph"/>
+        <w:numPr>
+          <w:ilvl w:val="0"/>
+          <w:numId w:val="1"/>
+        </w:numPr>
+        <w:spacing w:after="90"/>
+      </w:pPr>
+      <w:r>
+        <w:rPr>
+          <w:rFonts w:ascii="Calibri" w:cs="Calibri" w:eastAsia="Calibri" w:hAnsi="Calibri"/>
+          <w:color w:val="222222"/>
+          <w:sz w:val="21"/>
+          <w:szCs w:val="21"/>
+        </w:rPr>
+        <w:t xml:space="preserve">Crack monitoring using tell-tales</w:t>
+      </w:r>
+    </w:p>
+    <w:p>
+      <w:pPr>
+        <w:pStyle w:val="ListParagraph"/>
+        <w:numPr>
+          <w:ilvl w:val="0"/>
+          <w:numId w:val="1"/>
+        </w:numPr>
+        <w:spacing w:after="90"/>
+      </w:pPr>
+      <w:r>
+        <w:rPr>
+          <w:rFonts w:ascii="Calibri" w:cs="Calibri" w:eastAsia="Calibri" w:hAnsi="Calibri"/>
+          <w:color w:val="222222"/>
+          <w:sz w:val="21"/>
+          <w:szCs w:val="21"/>
+        </w:rPr>
+        <w:t xml:space="preserve">Level survey and contour baseline with repeat surveys</w:t>
+      </w:r>
+    </w:p>
+    <w:p>
+      <w:pPr>
+        <w:pStyle w:val="ListParagraph"/>
+        <w:numPr>
+          <w:ilvl w:val="0"/>
+          <w:numId w:val="1"/>
+        </w:numPr>
+        <w:spacing w:after="90"/>
+      </w:pPr>
+      <w:r>
+        <w:rPr>
+          <w:rFonts w:ascii="Calibri" w:cs="Calibri" w:eastAsia="Calibri" w:hAnsi="Calibri"/>
+          <w:color w:val="222222"/>
+          <w:sz w:val="21"/>
+          <w:szCs w:val="21"/>
+        </w:rPr>
+        <w:t xml:space="preserve">Instrumentation coordination</w:t>
+      </w:r>
+    </w:p>
+    <w:p>
+      <w:pPr>
+        <w:pStyle w:val="ListParagraph"/>
+        <w:numPr>
+          <w:ilvl w:val="0"/>
+          <w:numId w:val="1"/>
+        </w:numPr>
+        <w:spacing w:after="90"/>
+      </w:pPr>
+      <w:r>
+        <w:rPr>
+          <w:rFonts w:ascii="Calibri" w:cs="Calibri" w:eastAsia="Calibri" w:hAnsi="Calibri"/>
+          <w:color w:val="222222"/>
+          <w:sz w:val="21"/>
+          <w:szCs w:val="21"/>
+        </w:rPr>
+        <w:t xml:space="preserve">Post-works comparison condition survey</w:t>
+      </w:r>
+    </w:p>
+    <w:p>
+      <w:pPr>
+        <w:pStyle w:val="ListParagraph"/>
+        <w:numPr>
+          <w:ilvl w:val="0"/>
+          <w:numId w:val="1"/>
+        </w:numPr>
+        <w:spacing w:after="90"/>
+      </w:pPr>
+      <w:r>
+        <w:rPr>
+          <w:rFonts w:ascii="Calibri" w:cs="Calibri" w:eastAsia="Calibri" w:hAnsi="Calibri"/>
+          <w:color w:val="222222"/>
+          <w:sz w:val="21"/>
+          <w:szCs w:val="21"/>
+        </w:rPr>
+        <w:t xml:space="preserve">Damage triage and make-safe advice</w:t>
+      </w:r>
+    </w:p>
+    <w:p>
+      <w:pPr>
+        <w:pStyle w:val="ListParagraph"/>
+        <w:numPr>
+          <w:ilvl w:val="0"/>
+          <w:numId w:val="1"/>
+        </w:numPr>
+        <w:spacing w:after="90"/>
+      </w:pPr>
+      <w:r>
+        <w:rPr>
+          <w:rFonts w:ascii="Calibri" w:cs="Calibri" w:eastAsia="Calibri" w:hAnsi="Calibri"/>
+          <w:color w:val="222222"/>
+          <w:sz w:val="21"/>
+          <w:szCs w:val="21"/>
+        </w:rPr>
+        <w:t xml:space="preserve">Engineering inspection and causation report</w:t>
+      </w:r>
+    </w:p>
+    <w:p>
+      <w:pPr>
+        <w:pStyle w:val="ListParagraph"/>
+        <w:numPr>
+          <w:ilvl w:val="0"/>
+          <w:numId w:val="1"/>
+        </w:numPr>
+        <w:spacing w:after="90"/>
+      </w:pPr>
+      <w:r>
+        <w:rPr>
+          <w:rFonts w:ascii="Calibri" w:cs="Calibri" w:eastAsia="Calibri" w:hAnsi="Calibri"/>
+          <w:color w:val="222222"/>
+          <w:sz w:val="21"/>
+          <w:szCs w:val="21"/>
+        </w:rPr>
         <w:t xml:space="preserve">VCAT-compliant expert report</w:t>
       </w:r>
     </w:p>
@@ -4230,7 +7348,7 @@
           <w:sz w:val="21"/>
           <w:szCs w:val="21"/>
         </w:rPr>
-        <w:t xml:space="preserve">The sitewide block (see _sitewide-business.docx) must also be present on this page. This page's Service node references it by @id, so the two work together.</w:t>
+        <w:t xml:space="preserve">This block is self-contained. It carries the local business details itself, so nothing else needs to be added to the page.</w:t>
       </w:r>
     </w:p>
     <w:p>
@@ -4249,7 +7367,7 @@
           <w:sz w:val="21"/>
           <w:szCs w:val="21"/>
         </w:rPr>
-        <w:t xml:space="preserve">Rank Math: Page &gt; Rank Math &gt; Schema &gt; Custom Schema (Code Validation tab). Disable its auto-generated WebPage schema for this page so nodes are not duplicated.</w:t>
+        <w:t xml:space="preserve">The business @id is identical on every page, so the eleven copies resolve to one business entity rather than eleven separate ones. Do not change it per page.</w:t>
       </w:r>
     </w:p>
     <w:p>
@@ -4268,7 +7386,7 @@
           <w:sz w:val="21"/>
           <w:szCs w:val="21"/>
         </w:rPr>
-        <w:t xml:space="preserve">Yoast: Yoast already emits WebPage, BreadcrumbList and an Organization at #organization. In that case delete the WebPage and BreadcrumbList nodes from this block and keep only the Service node; its provider already points at #organization.</w:t>
+        <w:t xml:space="preserve">Rank Math: Page &gt; Rank Math &gt; Schema &gt; Custom Schema (Code Validation tab). Disable its auto-generated WebPage schema for this page so nodes are not duplicated.</w:t>
       </w:r>
     </w:p>
     <w:p>
@@ -4287,7 +7405,26 @@
           <w:sz w:val="21"/>
           <w:szCs w:val="21"/>
         </w:rPr>
-        <w:t xml:space="preserve">Do not ship two of the same node type on one page. If the theme or plugin already outputs BreadcrumbList, drop the one here.</w:t>
+        <w:t xml:space="preserve">Yoast: Yoast already emits WebPage, WebSite, BreadcrumbList and an Organization at #organization. In that case delete those four nodes from this block and keep only the Service node; its provider already points at #organization, so it attaches to Yoast's organisation automatically.</w:t>
+      </w:r>
+    </w:p>
+    <w:p>
+      <w:pPr>
+        <w:pStyle w:val="ListParagraph"/>
+        <w:numPr>
+          <w:ilvl w:val="0"/>
+          <w:numId w:val="1"/>
+        </w:numPr>
+        <w:spacing w:after="90"/>
+      </w:pPr>
+      <w:r>
+        <w:rPr>
+          <w:rFonts w:ascii="Calibri" w:cs="Calibri" w:eastAsia="Calibri" w:hAnsi="Calibri"/>
+          <w:color w:val="222222"/>
+          <w:sz w:val="21"/>
+          <w:szCs w:val="21"/>
+        </w:rPr>
+        <w:t xml:space="preserve">Do not ship two of the same node type on one page. If the theme or plugin already outputs BreadcrumbList or an organisation node, drop the duplicate here.</w:t>
       </w:r>
     </w:p>
     <w:p>

</xml_diff>